<commit_message>
Rewrite closing section as advisory prose; full-width aligned tables
Co-Authored-By: Claude Fable 5 <noreply@anthropic.com>
Claude-Session: https://claude.ai/code/session_014LXBRdRNFfe8YpiwXXqMWm
</commit_message>
<xml_diff>
--- a/New Projects/Keytree/Keytree - Structure selection memorandum.docx
+++ b/New Projects/Keytree/Keytree - Structure selection memorandum.docx
@@ -65,7 +65,7 @@
     </w:p>
     <w:tbl>
       <w:tblPr>
-        <w:tblW w:type="dxa" w:w="9576"/>
+        <w:tblW w:type="dxa" w:w="9750"/>
         <w:tblBorders>
           <w:top w:val="single" w:color="000000" w:sz="8"/>
           <w:left w:val="none"/>
@@ -77,7 +77,7 @@
       </w:tblPr>
       <w:tblGrid>
         <w:gridCol w:w="1750"/>
-        <w:gridCol w:w="7826"/>
+        <w:gridCol w:w="8000"/>
       </w:tblGrid>
       <w:tr>
         <w:tc>
@@ -114,7 +114,7 @@
         </w:tc>
         <w:tc>
           <w:tcPr>
-            <w:tcW w:type="dxa" w:w="7826"/>
+            <w:tcW w:type="dxa" w:w="8000"/>
             <w:tcMar>
               <w:top w:type="dxa" w:w="50"/>
               <w:left w:type="dxa" w:w="80"/>
@@ -180,7 +180,7 @@
         </w:tc>
         <w:tc>
           <w:tcPr>
-            <w:tcW w:type="dxa" w:w="7826"/>
+            <w:tcW w:type="dxa" w:w="8000"/>
             <w:tcMar>
               <w:top w:type="dxa" w:w="50"/>
               <w:left w:type="dxa" w:w="80"/>
@@ -246,7 +246,7 @@
         </w:tc>
         <w:tc>
           <w:tcPr>
-            <w:tcW w:type="dxa" w:w="7826"/>
+            <w:tcW w:type="dxa" w:w="8000"/>
             <w:tcMar>
               <w:top w:type="dxa" w:w="50"/>
               <w:left w:type="dxa" w:w="80"/>
@@ -312,7 +312,7 @@
         </w:tc>
         <w:tc>
           <w:tcPr>
-            <w:tcW w:type="dxa" w:w="7826"/>
+            <w:tcW w:type="dxa" w:w="8000"/>
             <w:tcMar>
               <w:top w:type="dxa" w:w="50"/>
               <w:left w:type="dxa" w:w="80"/>
@@ -378,7 +378,7 @@
         </w:tc>
         <w:tc>
           <w:tcPr>
-            <w:tcW w:type="dxa" w:w="7826"/>
+            <w:tcW w:type="dxa" w:w="8000"/>
             <w:tcMar>
               <w:top w:type="dxa" w:w="50"/>
               <w:left w:type="dxa" w:w="80"/>
@@ -469,7 +469,7 @@
           <w:sz w:val="18"/>
           <w:szCs w:val="18"/>
         </w:rPr>
-        <w:t xml:space="preserve">Mr Levy requires an 80/10/5/5 shareholding structure (himself, Starter Point, two minority holders), a 5% share of every distribution for each minority holder, and the ability to recover and redeploy the funds. This paper compares five structures against those objectives on company law, accounting, tax and practical grounds, in order for the shareholders to select one. Detailed resolutions and auditor-facing papers will follow the selection.</w:t>
+        <w:t xml:space="preserve">Mr Levy requires an 80/10/5/5 shareholding structure (himself, Starter Point, two minority holders), a 5% share of every distribution for each minority holder, and the ability to recover and redeploy the funds. This paper compares five structures against those objectives on company law, accounting, tax and practical grounds, so that the shareholders can select one. Detailed resolutions and auditor-facing papers will follow the selection.</w:t>
       </w:r>
     </w:p>
     <w:p>
@@ -494,7 +494,7 @@
     </w:p>
     <w:tbl>
       <w:tblPr>
-        <w:tblW w:type="dxa" w:w="9576"/>
+        <w:tblW w:type="dxa" w:w="9750"/>
         <w:tblBorders>
           <w:top w:val="single" w:color="000000" w:sz="8"/>
           <w:left w:val="none"/>
@@ -505,13 +505,13 @@
         </w:tblBorders>
       </w:tblPr>
       <w:tblGrid>
-        <w:gridCol w:w="4788"/>
-        <w:gridCol w:w="4788"/>
+        <w:gridCol w:w="4875"/>
+        <w:gridCol w:w="4875"/>
       </w:tblGrid>
       <w:tr>
         <w:tc>
           <w:tcPr>
-            <w:tcW w:type="dxa" w:w="4788"/>
+            <w:tcW w:type="dxa" w:w="4875"/>
             <w:tcMar>
               <w:top w:type="dxa" w:w="50"/>
               <w:left w:type="dxa" w:w="80"/>
@@ -543,7 +543,7 @@
         </w:tc>
         <w:tc>
           <w:tcPr>
-            <w:tcW w:type="dxa" w:w="4788"/>
+            <w:tcW w:type="dxa" w:w="4875"/>
             <w:tcMar>
               <w:top w:type="dxa" w:w="50"/>
               <w:left w:type="dxa" w:w="80"/>
@@ -577,7 +577,7 @@
       <w:tr>
         <w:tc>
           <w:tcPr>
-            <w:tcW w:type="dxa" w:w="4788"/>
+            <w:tcW w:type="dxa" w:w="4875"/>
             <w:tcMar>
               <w:top w:type="dxa" w:w="50"/>
               <w:left w:type="dxa" w:w="80"/>
@@ -609,7 +609,7 @@
         </w:tc>
         <w:tc>
           <w:tcPr>
-            <w:tcW w:type="dxa" w:w="4788"/>
+            <w:tcW w:type="dxa" w:w="4875"/>
             <w:tcMar>
               <w:top w:type="dxa" w:w="50"/>
               <w:left w:type="dxa" w:w="80"/>
@@ -684,7 +684,7 @@
     </w:p>
     <w:tbl>
       <w:tblPr>
-        <w:tblW w:type="dxa" w:w="9576"/>
+        <w:tblW w:type="dxa" w:w="9750"/>
         <w:tblBorders>
           <w:top w:val="single" w:color="000000" w:sz="8"/>
           <w:left w:val="none"/>
@@ -696,10 +696,10 @@
       </w:tblPr>
       <w:tblGrid>
         <w:gridCol w:w="1150"/>
-        <w:gridCol w:w="3050"/>
+        <w:gridCol w:w="3100"/>
+        <w:gridCol w:w="1800"/>
+        <w:gridCol w:w="1950"/>
         <w:gridCol w:w="1750"/>
-        <w:gridCol w:w="1900"/>
-        <w:gridCol w:w="1726"/>
       </w:tblGrid>
       <w:tr>
         <w:trPr>
@@ -740,7 +740,7 @@
         </w:tc>
         <w:tc>
           <w:tcPr>
-            <w:tcW w:type="dxa" w:w="3050"/>
+            <w:tcW w:type="dxa" w:w="3100"/>
             <w:shd w:fill="F2F2F2" w:val="clear"/>
             <w:tcMar>
               <w:top w:type="dxa" w:w="50"/>
@@ -773,6 +773,72 @@
         </w:tc>
         <w:tc>
           <w:tcPr>
+            <w:tcW w:type="dxa" w:w="1800"/>
+            <w:shd w:fill="F2F2F2" w:val="clear"/>
+            <w:tcMar>
+              <w:top w:type="dxa" w:w="50"/>
+              <w:left w:type="dxa" w:w="80"/>
+              <w:bottom w:type="dxa" w:w="30"/>
+              <w:right w:type="dxa" w:w="80"/>
+            </w:tcMar>
+            <w:vAlign w:val="top"/>
+          </w:tcPr>
+          <w:p>
+            <w:pPr>
+              <w:spacing w:after="20" w:line="228" w:lineRule="auto"/>
+              <w:jc w:val="left"/>
+            </w:pPr>
+            <w:r>
+              <w:rPr>
+                <w:rFonts w:ascii="Arial" w:cs="Arial" w:eastAsia="Arial" w:hAnsi="Arial"/>
+                <w:b/>
+                <w:bCs/>
+                <w:i w:val="false"/>
+                <w:iCs w:val="false"/>
+                <w:caps w:val="false"/>
+                <w:color w:val="000000"/>
+                <w:sz w:val="16"/>
+                <w:szCs w:val="16"/>
+              </w:rPr>
+              <w:t xml:space="preserve">Equity restored</w:t>
+            </w:r>
+          </w:p>
+        </w:tc>
+        <w:tc>
+          <w:tcPr>
+            <w:tcW w:type="dxa" w:w="1950"/>
+            <w:shd w:fill="F2F2F2" w:val="clear"/>
+            <w:tcMar>
+              <w:top w:type="dxa" w:w="50"/>
+              <w:left w:type="dxa" w:w="80"/>
+              <w:bottom w:type="dxa" w:w="30"/>
+              <w:right w:type="dxa" w:w="80"/>
+            </w:tcMar>
+            <w:vAlign w:val="top"/>
+          </w:tcPr>
+          <w:p>
+            <w:pPr>
+              <w:spacing w:after="20" w:line="228" w:lineRule="auto"/>
+              <w:jc w:val="left"/>
+            </w:pPr>
+            <w:r>
+              <w:rPr>
+                <w:rFonts w:ascii="Arial" w:cs="Arial" w:eastAsia="Arial" w:hAnsi="Arial"/>
+                <w:b/>
+                <w:bCs/>
+                <w:i w:val="false"/>
+                <w:iCs w:val="false"/>
+                <w:caps w:val="false"/>
+                <w:color w:val="000000"/>
+                <w:sz w:val="16"/>
+                <w:szCs w:val="16"/>
+              </w:rPr>
+              <w:t xml:space="preserve">Funds recoverable</w:t>
+            </w:r>
+          </w:p>
+        </w:tc>
+        <w:tc>
+          <w:tcPr>
             <w:tcW w:type="dxa" w:w="1750"/>
             <w:shd w:fill="F2F2F2" w:val="clear"/>
             <w:tcMar>
@@ -800,14 +866,15 @@
                 <w:sz w:val="16"/>
                 <w:szCs w:val="16"/>
               </w:rPr>
-              <w:t xml:space="preserve">Equity restored</w:t>
-            </w:r>
-          </w:p>
-        </w:tc>
-        <w:tc>
-          <w:tcPr>
-            <w:tcW w:type="dxa" w:w="1900"/>
-            <w:shd w:fill="F2F2F2" w:val="clear"/>
+              <w:t xml:space="preserve">Group tax effect</w:t>
+            </w:r>
+          </w:p>
+        </w:tc>
+      </w:tr>
+      <w:tr>
+        <w:tc>
+          <w:tcPr>
+            <w:tcW w:type="dxa" w:w="1150"/>
             <w:tcMar>
               <w:top w:type="dxa" w:w="50"/>
               <w:left w:type="dxa" w:w="80"/>
@@ -833,14 +900,143 @@
                 <w:sz w:val="16"/>
                 <w:szCs w:val="16"/>
               </w:rPr>
-              <w:t xml:space="preserve">Funds recoverable</w:t>
-            </w:r>
-          </w:p>
-        </w:tc>
-        <w:tc>
-          <w:tcPr>
-            <w:tcW w:type="dxa" w:w="1726"/>
-            <w:shd w:fill="F2F2F2" w:val="clear"/>
+              <w:t xml:space="preserve">1A</w:t>
+            </w:r>
+          </w:p>
+        </w:tc>
+        <w:tc>
+          <w:tcPr>
+            <w:tcW w:type="dxa" w:w="3100"/>
+            <w:tcMar>
+              <w:top w:type="dxa" w:w="50"/>
+              <w:left w:type="dxa" w:w="80"/>
+              <w:bottom w:type="dxa" w:w="30"/>
+              <w:right w:type="dxa" w:w="80"/>
+            </w:tcMar>
+            <w:vAlign w:val="top"/>
+          </w:tcPr>
+          <w:p>
+            <w:pPr>
+              <w:spacing w:after="20" w:line="228" w:lineRule="auto"/>
+              <w:jc w:val="left"/>
+            </w:pPr>
+            <w:r>
+              <w:rPr>
+                <w:rFonts w:ascii="Arial" w:cs="Arial" w:eastAsia="Arial" w:hAnsi="Arial"/>
+                <w:b w:val="false"/>
+                <w:bCs w:val="false"/>
+                <w:i w:val="false"/>
+                <w:iCs w:val="false"/>
+                <w:caps w:val="false"/>
+                <w:color w:val="000000"/>
+                <w:sz w:val="16"/>
+                <w:szCs w:val="16"/>
+              </w:rPr>
+              <w:t xml:space="preserve">Ordinary shares at a premium, plus bonus issue</w:t>
+            </w:r>
+          </w:p>
+        </w:tc>
+        <w:tc>
+          <w:tcPr>
+            <w:tcW w:type="dxa" w:w="1800"/>
+            <w:tcMar>
+              <w:top w:type="dxa" w:w="50"/>
+              <w:left w:type="dxa" w:w="80"/>
+              <w:bottom w:type="dxa" w:w="30"/>
+              <w:right w:type="dxa" w:w="80"/>
+            </w:tcMar>
+            <w:vAlign w:val="top"/>
+          </w:tcPr>
+          <w:p>
+            <w:pPr>
+              <w:spacing w:after="20" w:line="228" w:lineRule="auto"/>
+              <w:jc w:val="left"/>
+            </w:pPr>
+            <w:r>
+              <w:rPr>
+                <w:rFonts w:ascii="Arial" w:cs="Arial" w:eastAsia="Arial" w:hAnsi="Arial"/>
+                <w:b w:val="false"/>
+                <w:bCs w:val="false"/>
+                <w:i w:val="false"/>
+                <w:iCs w:val="false"/>
+                <w:caps w:val="false"/>
+                <w:color w:val="000000"/>
+                <w:sz w:val="16"/>
+                <w:szCs w:val="16"/>
+              </w:rPr>
+              <w:t xml:space="preserve">Yes, +€16,0m</w:t>
+            </w:r>
+          </w:p>
+        </w:tc>
+        <w:tc>
+          <w:tcPr>
+            <w:tcW w:type="dxa" w:w="1950"/>
+            <w:tcMar>
+              <w:top w:type="dxa" w:w="50"/>
+              <w:left w:type="dxa" w:w="80"/>
+              <w:bottom w:type="dxa" w:w="30"/>
+              <w:right w:type="dxa" w:w="80"/>
+            </w:tcMar>
+            <w:vAlign w:val="top"/>
+          </w:tcPr>
+          <w:p>
+            <w:pPr>
+              <w:spacing w:after="20" w:line="228" w:lineRule="auto"/>
+              <w:jc w:val="left"/>
+            </w:pPr>
+            <w:r>
+              <w:rPr>
+                <w:rFonts w:ascii="Arial" w:cs="Arial" w:eastAsia="Arial" w:hAnsi="Arial"/>
+                <w:b w:val="false"/>
+                <w:bCs w:val="false"/>
+                <w:i w:val="false"/>
+                <w:iCs w:val="false"/>
+                <w:caps w:val="false"/>
+                <w:color w:val="000000"/>
+                <w:sz w:val="16"/>
+                <w:szCs w:val="16"/>
+              </w:rPr>
+              <w:t xml:space="preserve">Court process</w:t>
+            </w:r>
+          </w:p>
+        </w:tc>
+        <w:tc>
+          <w:tcPr>
+            <w:tcW w:type="dxa" w:w="1750"/>
+            <w:tcMar>
+              <w:top w:type="dxa" w:w="50"/>
+              <w:left w:type="dxa" w:w="80"/>
+              <w:bottom w:type="dxa" w:w="30"/>
+              <w:right w:type="dxa" w:w="80"/>
+            </w:tcMar>
+            <w:vAlign w:val="top"/>
+          </w:tcPr>
+          <w:p>
+            <w:pPr>
+              <w:spacing w:after="20" w:line="228" w:lineRule="auto"/>
+              <w:jc w:val="right"/>
+            </w:pPr>
+            <w:r>
+              <w:rPr>
+                <w:rFonts w:ascii="Arial" w:cs="Arial" w:eastAsia="Arial" w:hAnsi="Arial"/>
+                <w:b w:val="false"/>
+                <w:bCs w:val="false"/>
+                <w:i w:val="false"/>
+                <w:iCs w:val="false"/>
+                <w:caps w:val="false"/>
+                <w:color w:val="000000"/>
+                <w:sz w:val="16"/>
+                <w:szCs w:val="16"/>
+              </w:rPr>
+              <w:t xml:space="preserve">Nil</w:t>
+            </w:r>
+          </w:p>
+        </w:tc>
+      </w:tr>
+      <w:tr>
+        <w:tc>
+          <w:tcPr>
+            <w:tcW w:type="dxa" w:w="1150"/>
             <w:tcMar>
               <w:top w:type="dxa" w:w="50"/>
               <w:left w:type="dxa" w:w="80"/>
@@ -866,7 +1062,135 @@
                 <w:sz w:val="16"/>
                 <w:szCs w:val="16"/>
               </w:rPr>
-              <w:t xml:space="preserve">Group tax effect</w:t>
+              <w:t xml:space="preserve">1B</w:t>
+            </w:r>
+          </w:p>
+        </w:tc>
+        <w:tc>
+          <w:tcPr>
+            <w:tcW w:type="dxa" w:w="3100"/>
+            <w:tcMar>
+              <w:top w:type="dxa" w:w="50"/>
+              <w:left w:type="dxa" w:w="80"/>
+              <w:bottom w:type="dxa" w:w="30"/>
+              <w:right w:type="dxa" w:w="80"/>
+            </w:tcMar>
+            <w:vAlign w:val="top"/>
+          </w:tcPr>
+          <w:p>
+            <w:pPr>
+              <w:spacing w:after="20" w:line="228" w:lineRule="auto"/>
+              <w:jc w:val="left"/>
+            </w:pPr>
+            <w:r>
+              <w:rPr>
+                <w:rFonts w:ascii="Arial" w:cs="Arial" w:eastAsia="Arial" w:hAnsi="Arial"/>
+                <w:b w:val="false"/>
+                <w:bCs w:val="false"/>
+                <w:i w:val="false"/>
+                <w:iCs w:val="false"/>
+                <w:caps w:val="false"/>
+                <w:color w:val="000000"/>
+                <w:sz w:val="16"/>
+                <w:szCs w:val="16"/>
+              </w:rPr>
+              <w:t xml:space="preserve">Redeemable preference, discretionary dividend</w:t>
+            </w:r>
+          </w:p>
+        </w:tc>
+        <w:tc>
+          <w:tcPr>
+            <w:tcW w:type="dxa" w:w="1800"/>
+            <w:tcMar>
+              <w:top w:type="dxa" w:w="50"/>
+              <w:left w:type="dxa" w:w="80"/>
+              <w:bottom w:type="dxa" w:w="30"/>
+              <w:right w:type="dxa" w:w="80"/>
+            </w:tcMar>
+            <w:vAlign w:val="top"/>
+          </w:tcPr>
+          <w:p>
+            <w:pPr>
+              <w:spacing w:after="20" w:line="228" w:lineRule="auto"/>
+              <w:jc w:val="left"/>
+            </w:pPr>
+            <w:r>
+              <w:rPr>
+                <w:rFonts w:ascii="Arial" w:cs="Arial" w:eastAsia="Arial" w:hAnsi="Arial"/>
+                <w:b w:val="false"/>
+                <w:bCs w:val="false"/>
+                <w:i w:val="false"/>
+                <w:iCs w:val="false"/>
+                <w:caps w:val="false"/>
+                <w:color w:val="000000"/>
+                <w:sz w:val="16"/>
+                <w:szCs w:val="16"/>
+              </w:rPr>
+              <w:t xml:space="preserve">Yes, +€16,0m</w:t>
+            </w:r>
+          </w:p>
+        </w:tc>
+        <w:tc>
+          <w:tcPr>
+            <w:tcW w:type="dxa" w:w="1950"/>
+            <w:tcMar>
+              <w:top w:type="dxa" w:w="50"/>
+              <w:left w:type="dxa" w:w="80"/>
+              <w:bottom w:type="dxa" w:w="30"/>
+              <w:right w:type="dxa" w:w="80"/>
+            </w:tcMar>
+            <w:vAlign w:val="top"/>
+          </w:tcPr>
+          <w:p>
+            <w:pPr>
+              <w:spacing w:after="20" w:line="228" w:lineRule="auto"/>
+              <w:jc w:val="left"/>
+            </w:pPr>
+            <w:r>
+              <w:rPr>
+                <w:rFonts w:ascii="Arial" w:cs="Arial" w:eastAsia="Arial" w:hAnsi="Arial"/>
+                <w:b w:val="false"/>
+                <w:bCs w:val="false"/>
+                <w:i w:val="false"/>
+                <w:iCs w:val="false"/>
+                <w:caps w:val="false"/>
+                <w:color w:val="000000"/>
+                <w:sz w:val="16"/>
+                <w:szCs w:val="16"/>
+              </w:rPr>
+              <w:t xml:space="preserve">After profits arise</w:t>
+            </w:r>
+          </w:p>
+        </w:tc>
+        <w:tc>
+          <w:tcPr>
+            <w:tcW w:type="dxa" w:w="1750"/>
+            <w:tcMar>
+              <w:top w:type="dxa" w:w="50"/>
+              <w:left w:type="dxa" w:w="80"/>
+              <w:bottom w:type="dxa" w:w="30"/>
+              <w:right w:type="dxa" w:w="80"/>
+            </w:tcMar>
+            <w:vAlign w:val="top"/>
+          </w:tcPr>
+          <w:p>
+            <w:pPr>
+              <w:spacing w:after="20" w:line="228" w:lineRule="auto"/>
+              <w:jc w:val="right"/>
+            </w:pPr>
+            <w:r>
+              <w:rPr>
+                <w:rFonts w:ascii="Arial" w:cs="Arial" w:eastAsia="Arial" w:hAnsi="Arial"/>
+                <w:b w:val="false"/>
+                <w:bCs w:val="false"/>
+                <w:i w:val="false"/>
+                <w:iCs w:val="false"/>
+                <w:caps w:val="false"/>
+                <w:color w:val="000000"/>
+                <w:sz w:val="16"/>
+                <w:szCs w:val="16"/>
+              </w:rPr>
+              <w:t xml:space="preserve">Nil</w:t>
             </w:r>
           </w:p>
         </w:tc>
@@ -900,109 +1224,109 @@
                 <w:sz w:val="16"/>
                 <w:szCs w:val="16"/>
               </w:rPr>
-              <w:t xml:space="preserve">1A</w:t>
-            </w:r>
-          </w:p>
-        </w:tc>
-        <w:tc>
-          <w:tcPr>
-            <w:tcW w:type="dxa" w:w="3050"/>
-            <w:tcMar>
-              <w:top w:type="dxa" w:w="50"/>
-              <w:left w:type="dxa" w:w="80"/>
-              <w:bottom w:type="dxa" w:w="30"/>
-              <w:right w:type="dxa" w:w="80"/>
-            </w:tcMar>
-            <w:vAlign w:val="top"/>
-          </w:tcPr>
-          <w:p>
-            <w:pPr>
-              <w:spacing w:after="20" w:line="228" w:lineRule="auto"/>
-              <w:jc w:val="left"/>
-            </w:pPr>
-            <w:r>
-              <w:rPr>
-                <w:rFonts w:ascii="Arial" w:cs="Arial" w:eastAsia="Arial" w:hAnsi="Arial"/>
-                <w:b w:val="false"/>
-                <w:bCs w:val="false"/>
-                <w:i w:val="false"/>
-                <w:iCs w:val="false"/>
-                <w:caps w:val="false"/>
-                <w:color w:val="000000"/>
-                <w:sz w:val="16"/>
-                <w:szCs w:val="16"/>
-              </w:rPr>
-              <w:t xml:space="preserve">Ordinary shares at a premium, plus bonus issue</w:t>
+              <w:t xml:space="preserve">1C</w:t>
+            </w:r>
+          </w:p>
+        </w:tc>
+        <w:tc>
+          <w:tcPr>
+            <w:tcW w:type="dxa" w:w="3100"/>
+            <w:tcMar>
+              <w:top w:type="dxa" w:w="50"/>
+              <w:left w:type="dxa" w:w="80"/>
+              <w:bottom w:type="dxa" w:w="30"/>
+              <w:right w:type="dxa" w:w="80"/>
+            </w:tcMar>
+            <w:vAlign w:val="top"/>
+          </w:tcPr>
+          <w:p>
+            <w:pPr>
+              <w:spacing w:after="20" w:line="228" w:lineRule="auto"/>
+              <w:jc w:val="left"/>
+            </w:pPr>
+            <w:r>
+              <w:rPr>
+                <w:rFonts w:ascii="Arial" w:cs="Arial" w:eastAsia="Arial" w:hAnsi="Arial"/>
+                <w:b w:val="false"/>
+                <w:bCs w:val="false"/>
+                <w:i w:val="false"/>
+                <w:iCs w:val="false"/>
+                <w:caps w:val="false"/>
+                <w:color w:val="000000"/>
+                <w:sz w:val="16"/>
+                <w:szCs w:val="16"/>
+              </w:rPr>
+              <w:t xml:space="preserve">Preference with fixed 8% entitlement</w:t>
+            </w:r>
+          </w:p>
+        </w:tc>
+        <w:tc>
+          <w:tcPr>
+            <w:tcW w:type="dxa" w:w="1800"/>
+            <w:tcMar>
+              <w:top w:type="dxa" w:w="50"/>
+              <w:left w:type="dxa" w:w="80"/>
+              <w:bottom w:type="dxa" w:w="30"/>
+              <w:right w:type="dxa" w:w="80"/>
+            </w:tcMar>
+            <w:vAlign w:val="top"/>
+          </w:tcPr>
+          <w:p>
+            <w:pPr>
+              <w:spacing w:after="20" w:line="228" w:lineRule="auto"/>
+              <w:jc w:val="left"/>
+            </w:pPr>
+            <w:r>
+              <w:rPr>
+                <w:rFonts w:ascii="Arial" w:cs="Arial" w:eastAsia="Arial" w:hAnsi="Arial"/>
+                <w:b w:val="false"/>
+                <w:bCs w:val="false"/>
+                <w:i w:val="false"/>
+                <w:iCs w:val="false"/>
+                <w:caps w:val="false"/>
+                <w:color w:val="000000"/>
+                <w:sz w:val="16"/>
+                <w:szCs w:val="16"/>
+              </w:rPr>
+              <w:t xml:space="preserve">No - liability</w:t>
+            </w:r>
+          </w:p>
+        </w:tc>
+        <w:tc>
+          <w:tcPr>
+            <w:tcW w:type="dxa" w:w="1950"/>
+            <w:tcMar>
+              <w:top w:type="dxa" w:w="50"/>
+              <w:left w:type="dxa" w:w="80"/>
+              <w:bottom w:type="dxa" w:w="30"/>
+              <w:right w:type="dxa" w:w="80"/>
+            </w:tcMar>
+            <w:vAlign w:val="top"/>
+          </w:tcPr>
+          <w:p>
+            <w:pPr>
+              <w:spacing w:after="20" w:line="228" w:lineRule="auto"/>
+              <w:jc w:val="left"/>
+            </w:pPr>
+            <w:r>
+              <w:rPr>
+                <w:rFonts w:ascii="Arial" w:cs="Arial" w:eastAsia="Arial" w:hAnsi="Arial"/>
+                <w:b w:val="false"/>
+                <w:bCs w:val="false"/>
+                <w:i w:val="false"/>
+                <w:iCs w:val="false"/>
+                <w:caps w:val="false"/>
+                <w:color w:val="000000"/>
+                <w:sz w:val="16"/>
+                <w:szCs w:val="16"/>
+              </w:rPr>
+              <w:t xml:space="preserve">After profits arise</w:t>
             </w:r>
           </w:p>
         </w:tc>
         <w:tc>
           <w:tcPr>
             <w:tcW w:type="dxa" w:w="1750"/>
-            <w:tcMar>
-              <w:top w:type="dxa" w:w="50"/>
-              <w:left w:type="dxa" w:w="80"/>
-              <w:bottom w:type="dxa" w:w="30"/>
-              <w:right w:type="dxa" w:w="80"/>
-            </w:tcMar>
-            <w:vAlign w:val="top"/>
-          </w:tcPr>
-          <w:p>
-            <w:pPr>
-              <w:spacing w:after="20" w:line="228" w:lineRule="auto"/>
-              <w:jc w:val="left"/>
-            </w:pPr>
-            <w:r>
-              <w:rPr>
-                <w:rFonts w:ascii="Arial" w:cs="Arial" w:eastAsia="Arial" w:hAnsi="Arial"/>
-                <w:b w:val="false"/>
-                <w:bCs w:val="false"/>
-                <w:i w:val="false"/>
-                <w:iCs w:val="false"/>
-                <w:caps w:val="false"/>
-                <w:color w:val="000000"/>
-                <w:sz w:val="16"/>
-                <w:szCs w:val="16"/>
-              </w:rPr>
-              <w:t xml:space="preserve">Yes, +€16,0m</w:t>
-            </w:r>
-          </w:p>
-        </w:tc>
-        <w:tc>
-          <w:tcPr>
-            <w:tcW w:type="dxa" w:w="1900"/>
-            <w:tcMar>
-              <w:top w:type="dxa" w:w="50"/>
-              <w:left w:type="dxa" w:w="80"/>
-              <w:bottom w:type="dxa" w:w="30"/>
-              <w:right w:type="dxa" w:w="80"/>
-            </w:tcMar>
-            <w:vAlign w:val="top"/>
-          </w:tcPr>
-          <w:p>
-            <w:pPr>
-              <w:spacing w:after="20" w:line="228" w:lineRule="auto"/>
-              <w:jc w:val="left"/>
-            </w:pPr>
-            <w:r>
-              <w:rPr>
-                <w:rFonts w:ascii="Arial" w:cs="Arial" w:eastAsia="Arial" w:hAnsi="Arial"/>
-                <w:b w:val="false"/>
-                <w:bCs w:val="false"/>
-                <w:i w:val="false"/>
-                <w:iCs w:val="false"/>
-                <w:caps w:val="false"/>
-                <w:color w:val="000000"/>
-                <w:sz w:val="16"/>
-                <w:szCs w:val="16"/>
-              </w:rPr>
-              <w:t xml:space="preserve">Court process</w:t>
-            </w:r>
-          </w:p>
-        </w:tc>
-        <w:tc>
-          <w:tcPr>
-            <w:tcW w:type="dxa" w:w="1726"/>
             <w:tcMar>
               <w:top w:type="dxa" w:w="50"/>
               <w:left w:type="dxa" w:w="80"/>
@@ -1062,109 +1386,109 @@
                 <w:sz w:val="16"/>
                 <w:szCs w:val="16"/>
               </w:rPr>
-              <w:t xml:space="preserve">1B</w:t>
-            </w:r>
-          </w:p>
-        </w:tc>
-        <w:tc>
-          <w:tcPr>
-            <w:tcW w:type="dxa" w:w="3050"/>
-            <w:tcMar>
-              <w:top w:type="dxa" w:w="50"/>
-              <w:left w:type="dxa" w:w="80"/>
-              <w:bottom w:type="dxa" w:w="30"/>
-              <w:right w:type="dxa" w:w="80"/>
-            </w:tcMar>
-            <w:vAlign w:val="top"/>
-          </w:tcPr>
-          <w:p>
-            <w:pPr>
-              <w:spacing w:after="20" w:line="228" w:lineRule="auto"/>
-              <w:jc w:val="left"/>
-            </w:pPr>
-            <w:r>
-              <w:rPr>
-                <w:rFonts w:ascii="Arial" w:cs="Arial" w:eastAsia="Arial" w:hAnsi="Arial"/>
-                <w:b w:val="false"/>
-                <w:bCs w:val="false"/>
-                <w:i w:val="false"/>
-                <w:iCs w:val="false"/>
-                <w:caps w:val="false"/>
-                <w:color w:val="000000"/>
-                <w:sz w:val="16"/>
-                <w:szCs w:val="16"/>
-              </w:rPr>
-              <w:t xml:space="preserve">Redeemable preference, discretionary dividend</w:t>
+              <w:t xml:space="preserve">2</w:t>
+            </w:r>
+          </w:p>
+        </w:tc>
+        <w:tc>
+          <w:tcPr>
+            <w:tcW w:type="dxa" w:w="3100"/>
+            <w:tcMar>
+              <w:top w:type="dxa" w:w="50"/>
+              <w:left w:type="dxa" w:w="80"/>
+              <w:bottom w:type="dxa" w:w="30"/>
+              <w:right w:type="dxa" w:w="80"/>
+            </w:tcMar>
+            <w:vAlign w:val="top"/>
+          </w:tcPr>
+          <w:p>
+            <w:pPr>
+              <w:spacing w:after="20" w:line="228" w:lineRule="auto"/>
+              <w:jc w:val="left"/>
+            </w:pPr>
+            <w:r>
+              <w:rPr>
+                <w:rFonts w:ascii="Arial" w:cs="Arial" w:eastAsia="Arial" w:hAnsi="Arial"/>
+                <w:b w:val="false"/>
+                <w:bCs w:val="false"/>
+                <w:i w:val="false"/>
+                <w:iCs w:val="false"/>
+                <w:caps w:val="false"/>
+                <w:color w:val="000000"/>
+                <w:sz w:val="16"/>
+                <w:szCs w:val="16"/>
+              </w:rPr>
+              <w:t xml:space="preserve">Cyprus holding company subscribing equity</w:t>
+            </w:r>
+          </w:p>
+        </w:tc>
+        <w:tc>
+          <w:tcPr>
+            <w:tcW w:type="dxa" w:w="1800"/>
+            <w:tcMar>
+              <w:top w:type="dxa" w:w="50"/>
+              <w:left w:type="dxa" w:w="80"/>
+              <w:bottom w:type="dxa" w:w="30"/>
+              <w:right w:type="dxa" w:w="80"/>
+            </w:tcMar>
+            <w:vAlign w:val="top"/>
+          </w:tcPr>
+          <w:p>
+            <w:pPr>
+              <w:spacing w:after="20" w:line="228" w:lineRule="auto"/>
+              <w:jc w:val="left"/>
+            </w:pPr>
+            <w:r>
+              <w:rPr>
+                <w:rFonts w:ascii="Arial" w:cs="Arial" w:eastAsia="Arial" w:hAnsi="Arial"/>
+                <w:b w:val="false"/>
+                <w:bCs w:val="false"/>
+                <w:i w:val="false"/>
+                <w:iCs w:val="false"/>
+                <w:caps w:val="false"/>
+                <w:color w:val="000000"/>
+                <w:sz w:val="16"/>
+                <w:szCs w:val="16"/>
+              </w:rPr>
+              <w:t xml:space="preserve">Yes, +€16,0m</w:t>
+            </w:r>
+          </w:p>
+        </w:tc>
+        <w:tc>
+          <w:tcPr>
+            <w:tcW w:type="dxa" w:w="1950"/>
+            <w:tcMar>
+              <w:top w:type="dxa" w:w="50"/>
+              <w:left w:type="dxa" w:w="80"/>
+              <w:bottom w:type="dxa" w:w="30"/>
+              <w:right w:type="dxa" w:w="80"/>
+            </w:tcMar>
+            <w:vAlign w:val="top"/>
+          </w:tcPr>
+          <w:p>
+            <w:pPr>
+              <w:spacing w:after="20" w:line="228" w:lineRule="auto"/>
+              <w:jc w:val="left"/>
+            </w:pPr>
+            <w:r>
+              <w:rPr>
+                <w:rFonts w:ascii="Arial" w:cs="Arial" w:eastAsia="Arial" w:hAnsi="Arial"/>
+                <w:b w:val="false"/>
+                <w:bCs w:val="false"/>
+                <w:i w:val="false"/>
+                <w:iCs w:val="false"/>
+                <w:caps w:val="false"/>
+                <w:color w:val="000000"/>
+                <w:sz w:val="16"/>
+                <w:szCs w:val="16"/>
+              </w:rPr>
+              <w:t xml:space="preserve">Court process</w:t>
             </w:r>
           </w:p>
         </w:tc>
         <w:tc>
           <w:tcPr>
             <w:tcW w:type="dxa" w:w="1750"/>
-            <w:tcMar>
-              <w:top w:type="dxa" w:w="50"/>
-              <w:left w:type="dxa" w:w="80"/>
-              <w:bottom w:type="dxa" w:w="30"/>
-              <w:right w:type="dxa" w:w="80"/>
-            </w:tcMar>
-            <w:vAlign w:val="top"/>
-          </w:tcPr>
-          <w:p>
-            <w:pPr>
-              <w:spacing w:after="20" w:line="228" w:lineRule="auto"/>
-              <w:jc w:val="left"/>
-            </w:pPr>
-            <w:r>
-              <w:rPr>
-                <w:rFonts w:ascii="Arial" w:cs="Arial" w:eastAsia="Arial" w:hAnsi="Arial"/>
-                <w:b w:val="false"/>
-                <w:bCs w:val="false"/>
-                <w:i w:val="false"/>
-                <w:iCs w:val="false"/>
-                <w:caps w:val="false"/>
-                <w:color w:val="000000"/>
-                <w:sz w:val="16"/>
-                <w:szCs w:val="16"/>
-              </w:rPr>
-              <w:t xml:space="preserve">Yes, +€16,0m</w:t>
-            </w:r>
-          </w:p>
-        </w:tc>
-        <w:tc>
-          <w:tcPr>
-            <w:tcW w:type="dxa" w:w="1900"/>
-            <w:tcMar>
-              <w:top w:type="dxa" w:w="50"/>
-              <w:left w:type="dxa" w:w="80"/>
-              <w:bottom w:type="dxa" w:w="30"/>
-              <w:right w:type="dxa" w:w="80"/>
-            </w:tcMar>
-            <w:vAlign w:val="top"/>
-          </w:tcPr>
-          <w:p>
-            <w:pPr>
-              <w:spacing w:after="20" w:line="228" w:lineRule="auto"/>
-              <w:jc w:val="left"/>
-            </w:pPr>
-            <w:r>
-              <w:rPr>
-                <w:rFonts w:ascii="Arial" w:cs="Arial" w:eastAsia="Arial" w:hAnsi="Arial"/>
-                <w:b w:val="false"/>
-                <w:bCs w:val="false"/>
-                <w:i w:val="false"/>
-                <w:iCs w:val="false"/>
-                <w:caps w:val="false"/>
-                <w:color w:val="000000"/>
-                <w:sz w:val="16"/>
-                <w:szCs w:val="16"/>
-              </w:rPr>
-              <w:t xml:space="preserve">After profits arise</w:t>
-            </w:r>
-          </w:p>
-        </w:tc>
-        <w:tc>
-          <w:tcPr>
-            <w:tcW w:type="dxa" w:w="1726"/>
             <w:tcMar>
               <w:top w:type="dxa" w:w="50"/>
               <w:left w:type="dxa" w:w="80"/>
@@ -1224,433 +1548,109 @@
                 <w:sz w:val="16"/>
                 <w:szCs w:val="16"/>
               </w:rPr>
-              <w:t xml:space="preserve">1C</w:t>
-            </w:r>
-          </w:p>
-        </w:tc>
-        <w:tc>
-          <w:tcPr>
-            <w:tcW w:type="dxa" w:w="3050"/>
-            <w:tcMar>
-              <w:top w:type="dxa" w:w="50"/>
-              <w:left w:type="dxa" w:w="80"/>
-              <w:bottom w:type="dxa" w:w="30"/>
-              <w:right w:type="dxa" w:w="80"/>
-            </w:tcMar>
-            <w:vAlign w:val="top"/>
-          </w:tcPr>
-          <w:p>
-            <w:pPr>
-              <w:spacing w:after="20" w:line="228" w:lineRule="auto"/>
-              <w:jc w:val="left"/>
-            </w:pPr>
-            <w:r>
-              <w:rPr>
-                <w:rFonts w:ascii="Arial" w:cs="Arial" w:eastAsia="Arial" w:hAnsi="Arial"/>
-                <w:b w:val="false"/>
-                <w:bCs w:val="false"/>
-                <w:i w:val="false"/>
-                <w:iCs w:val="false"/>
-                <w:caps w:val="false"/>
-                <w:color w:val="000000"/>
-                <w:sz w:val="16"/>
-                <w:szCs w:val="16"/>
-              </w:rPr>
-              <w:t xml:space="preserve">Preference with fixed 8% entitlement</w:t>
+              <w:t xml:space="preserve">3</w:t>
+            </w:r>
+          </w:p>
+        </w:tc>
+        <w:tc>
+          <w:tcPr>
+            <w:tcW w:type="dxa" w:w="3100"/>
+            <w:tcMar>
+              <w:top w:type="dxa" w:w="50"/>
+              <w:left w:type="dxa" w:w="80"/>
+              <w:bottom w:type="dxa" w:w="30"/>
+              <w:right w:type="dxa" w:w="80"/>
+            </w:tcMar>
+            <w:vAlign w:val="top"/>
+          </w:tcPr>
+          <w:p>
+            <w:pPr>
+              <w:spacing w:after="20" w:line="228" w:lineRule="auto"/>
+              <w:jc w:val="left"/>
+            </w:pPr>
+            <w:r>
+              <w:rPr>
+                <w:rFonts w:ascii="Arial" w:cs="Arial" w:eastAsia="Arial" w:hAnsi="Arial"/>
+                <w:b w:val="false"/>
+                <w:bCs w:val="false"/>
+                <w:i w:val="false"/>
+                <w:iCs w:val="false"/>
+                <w:caps w:val="false"/>
+                <w:color w:val="000000"/>
+                <w:sz w:val="16"/>
+                <w:szCs w:val="16"/>
+              </w:rPr>
+              <w:t xml:space="preserve">Cyprus finance company lending at arm’s length</w:t>
+            </w:r>
+          </w:p>
+        </w:tc>
+        <w:tc>
+          <w:tcPr>
+            <w:tcW w:type="dxa" w:w="1800"/>
+            <w:tcMar>
+              <w:top w:type="dxa" w:w="50"/>
+              <w:left w:type="dxa" w:w="80"/>
+              <w:bottom w:type="dxa" w:w="30"/>
+              <w:right w:type="dxa" w:w="80"/>
+            </w:tcMar>
+            <w:vAlign w:val="top"/>
+          </w:tcPr>
+          <w:p>
+            <w:pPr>
+              <w:spacing w:after="20" w:line="228" w:lineRule="auto"/>
+              <w:jc w:val="left"/>
+            </w:pPr>
+            <w:r>
+              <w:rPr>
+                <w:rFonts w:ascii="Arial" w:cs="Arial" w:eastAsia="Arial" w:hAnsi="Arial"/>
+                <w:b w:val="false"/>
+                <w:bCs w:val="false"/>
+                <w:i w:val="false"/>
+                <w:iCs w:val="false"/>
+                <w:caps w:val="false"/>
+                <w:color w:val="000000"/>
+                <w:sz w:val="16"/>
+                <w:szCs w:val="16"/>
+              </w:rPr>
+              <w:t xml:space="preserve">No</w:t>
+            </w:r>
+          </w:p>
+        </w:tc>
+        <w:tc>
+          <w:tcPr>
+            <w:tcW w:type="dxa" w:w="1950"/>
+            <w:tcMar>
+              <w:top w:type="dxa" w:w="50"/>
+              <w:left w:type="dxa" w:w="80"/>
+              <w:bottom w:type="dxa" w:w="30"/>
+              <w:right w:type="dxa" w:w="80"/>
+            </w:tcMar>
+            <w:vAlign w:val="top"/>
+          </w:tcPr>
+          <w:p>
+            <w:pPr>
+              <w:spacing w:after="20" w:line="228" w:lineRule="auto"/>
+              <w:jc w:val="left"/>
+            </w:pPr>
+            <w:r>
+              <w:rPr>
+                <w:rFonts w:ascii="Arial" w:cs="Arial" w:eastAsia="Arial" w:hAnsi="Arial"/>
+                <w:b w:val="false"/>
+                <w:bCs w:val="false"/>
+                <w:i w:val="false"/>
+                <w:iCs w:val="false"/>
+                <w:caps w:val="false"/>
+                <w:color w:val="000000"/>
+                <w:sz w:val="16"/>
+                <w:szCs w:val="16"/>
+              </w:rPr>
+              <w:t xml:space="preserve">At any time</w:t>
             </w:r>
           </w:p>
         </w:tc>
         <w:tc>
           <w:tcPr>
             <w:tcW w:type="dxa" w:w="1750"/>
-            <w:tcMar>
-              <w:top w:type="dxa" w:w="50"/>
-              <w:left w:type="dxa" w:w="80"/>
-              <w:bottom w:type="dxa" w:w="30"/>
-              <w:right w:type="dxa" w:w="80"/>
-            </w:tcMar>
-            <w:vAlign w:val="top"/>
-          </w:tcPr>
-          <w:p>
-            <w:pPr>
-              <w:spacing w:after="20" w:line="228" w:lineRule="auto"/>
-              <w:jc w:val="left"/>
-            </w:pPr>
-            <w:r>
-              <w:rPr>
-                <w:rFonts w:ascii="Arial" w:cs="Arial" w:eastAsia="Arial" w:hAnsi="Arial"/>
-                <w:b w:val="false"/>
-                <w:bCs w:val="false"/>
-                <w:i w:val="false"/>
-                <w:iCs w:val="false"/>
-                <w:caps w:val="false"/>
-                <w:color w:val="000000"/>
-                <w:sz w:val="16"/>
-                <w:szCs w:val="16"/>
-              </w:rPr>
-              <w:t xml:space="preserve">No - liability</w:t>
-            </w:r>
-          </w:p>
-        </w:tc>
-        <w:tc>
-          <w:tcPr>
-            <w:tcW w:type="dxa" w:w="1900"/>
-            <w:tcMar>
-              <w:top w:type="dxa" w:w="50"/>
-              <w:left w:type="dxa" w:w="80"/>
-              <w:bottom w:type="dxa" w:w="30"/>
-              <w:right w:type="dxa" w:w="80"/>
-            </w:tcMar>
-            <w:vAlign w:val="top"/>
-          </w:tcPr>
-          <w:p>
-            <w:pPr>
-              <w:spacing w:after="20" w:line="228" w:lineRule="auto"/>
-              <w:jc w:val="left"/>
-            </w:pPr>
-            <w:r>
-              <w:rPr>
-                <w:rFonts w:ascii="Arial" w:cs="Arial" w:eastAsia="Arial" w:hAnsi="Arial"/>
-                <w:b w:val="false"/>
-                <w:bCs w:val="false"/>
-                <w:i w:val="false"/>
-                <w:iCs w:val="false"/>
-                <w:caps w:val="false"/>
-                <w:color w:val="000000"/>
-                <w:sz w:val="16"/>
-                <w:szCs w:val="16"/>
-              </w:rPr>
-              <w:t xml:space="preserve">After profits arise</w:t>
-            </w:r>
-          </w:p>
-        </w:tc>
-        <w:tc>
-          <w:tcPr>
-            <w:tcW w:type="dxa" w:w="1726"/>
-            <w:tcMar>
-              <w:top w:type="dxa" w:w="50"/>
-              <w:left w:type="dxa" w:w="80"/>
-              <w:bottom w:type="dxa" w:w="30"/>
-              <w:right w:type="dxa" w:w="80"/>
-            </w:tcMar>
-            <w:vAlign w:val="top"/>
-          </w:tcPr>
-          <w:p>
-            <w:pPr>
-              <w:spacing w:after="20" w:line="228" w:lineRule="auto"/>
-              <w:jc w:val="right"/>
-            </w:pPr>
-            <w:r>
-              <w:rPr>
-                <w:rFonts w:ascii="Arial" w:cs="Arial" w:eastAsia="Arial" w:hAnsi="Arial"/>
-                <w:b w:val="false"/>
-                <w:bCs w:val="false"/>
-                <w:i w:val="false"/>
-                <w:iCs w:val="false"/>
-                <w:caps w:val="false"/>
-                <w:color w:val="000000"/>
-                <w:sz w:val="16"/>
-                <w:szCs w:val="16"/>
-              </w:rPr>
-              <w:t xml:space="preserve">Nil</w:t>
-            </w:r>
-          </w:p>
-        </w:tc>
-      </w:tr>
-      <w:tr>
-        <w:tc>
-          <w:tcPr>
-            <w:tcW w:type="dxa" w:w="1150"/>
-            <w:tcMar>
-              <w:top w:type="dxa" w:w="50"/>
-              <w:left w:type="dxa" w:w="80"/>
-              <w:bottom w:type="dxa" w:w="30"/>
-              <w:right w:type="dxa" w:w="80"/>
-            </w:tcMar>
-            <w:vAlign w:val="top"/>
-          </w:tcPr>
-          <w:p>
-            <w:pPr>
-              <w:spacing w:after="20" w:line="228" w:lineRule="auto"/>
-              <w:jc w:val="left"/>
-            </w:pPr>
-            <w:r>
-              <w:rPr>
-                <w:rFonts w:ascii="Arial" w:cs="Arial" w:eastAsia="Arial" w:hAnsi="Arial"/>
-                <w:b/>
-                <w:bCs/>
-                <w:i w:val="false"/>
-                <w:iCs w:val="false"/>
-                <w:caps w:val="false"/>
-                <w:color w:val="000000"/>
-                <w:sz w:val="16"/>
-                <w:szCs w:val="16"/>
-              </w:rPr>
-              <w:t xml:space="preserve">2</w:t>
-            </w:r>
-          </w:p>
-        </w:tc>
-        <w:tc>
-          <w:tcPr>
-            <w:tcW w:type="dxa" w:w="3050"/>
-            <w:tcMar>
-              <w:top w:type="dxa" w:w="50"/>
-              <w:left w:type="dxa" w:w="80"/>
-              <w:bottom w:type="dxa" w:w="30"/>
-              <w:right w:type="dxa" w:w="80"/>
-            </w:tcMar>
-            <w:vAlign w:val="top"/>
-          </w:tcPr>
-          <w:p>
-            <w:pPr>
-              <w:spacing w:after="20" w:line="228" w:lineRule="auto"/>
-              <w:jc w:val="left"/>
-            </w:pPr>
-            <w:r>
-              <w:rPr>
-                <w:rFonts w:ascii="Arial" w:cs="Arial" w:eastAsia="Arial" w:hAnsi="Arial"/>
-                <w:b w:val="false"/>
-                <w:bCs w:val="false"/>
-                <w:i w:val="false"/>
-                <w:iCs w:val="false"/>
-                <w:caps w:val="false"/>
-                <w:color w:val="000000"/>
-                <w:sz w:val="16"/>
-                <w:szCs w:val="16"/>
-              </w:rPr>
-              <w:t xml:space="preserve">Cyprus holding company subscribing equity</w:t>
-            </w:r>
-          </w:p>
-        </w:tc>
-        <w:tc>
-          <w:tcPr>
-            <w:tcW w:type="dxa" w:w="1750"/>
-            <w:tcMar>
-              <w:top w:type="dxa" w:w="50"/>
-              <w:left w:type="dxa" w:w="80"/>
-              <w:bottom w:type="dxa" w:w="30"/>
-              <w:right w:type="dxa" w:w="80"/>
-            </w:tcMar>
-            <w:vAlign w:val="top"/>
-          </w:tcPr>
-          <w:p>
-            <w:pPr>
-              <w:spacing w:after="20" w:line="228" w:lineRule="auto"/>
-              <w:jc w:val="left"/>
-            </w:pPr>
-            <w:r>
-              <w:rPr>
-                <w:rFonts w:ascii="Arial" w:cs="Arial" w:eastAsia="Arial" w:hAnsi="Arial"/>
-                <w:b w:val="false"/>
-                <w:bCs w:val="false"/>
-                <w:i w:val="false"/>
-                <w:iCs w:val="false"/>
-                <w:caps w:val="false"/>
-                <w:color w:val="000000"/>
-                <w:sz w:val="16"/>
-                <w:szCs w:val="16"/>
-              </w:rPr>
-              <w:t xml:space="preserve">Yes, +€16,0m</w:t>
-            </w:r>
-          </w:p>
-        </w:tc>
-        <w:tc>
-          <w:tcPr>
-            <w:tcW w:type="dxa" w:w="1900"/>
-            <w:tcMar>
-              <w:top w:type="dxa" w:w="50"/>
-              <w:left w:type="dxa" w:w="80"/>
-              <w:bottom w:type="dxa" w:w="30"/>
-              <w:right w:type="dxa" w:w="80"/>
-            </w:tcMar>
-            <w:vAlign w:val="top"/>
-          </w:tcPr>
-          <w:p>
-            <w:pPr>
-              <w:spacing w:after="20" w:line="228" w:lineRule="auto"/>
-              <w:jc w:val="left"/>
-            </w:pPr>
-            <w:r>
-              <w:rPr>
-                <w:rFonts w:ascii="Arial" w:cs="Arial" w:eastAsia="Arial" w:hAnsi="Arial"/>
-                <w:b w:val="false"/>
-                <w:bCs w:val="false"/>
-                <w:i w:val="false"/>
-                <w:iCs w:val="false"/>
-                <w:caps w:val="false"/>
-                <w:color w:val="000000"/>
-                <w:sz w:val="16"/>
-                <w:szCs w:val="16"/>
-              </w:rPr>
-              <w:t xml:space="preserve">Court process</w:t>
-            </w:r>
-          </w:p>
-        </w:tc>
-        <w:tc>
-          <w:tcPr>
-            <w:tcW w:type="dxa" w:w="1726"/>
-            <w:tcMar>
-              <w:top w:type="dxa" w:w="50"/>
-              <w:left w:type="dxa" w:w="80"/>
-              <w:bottom w:type="dxa" w:w="30"/>
-              <w:right w:type="dxa" w:w="80"/>
-            </w:tcMar>
-            <w:vAlign w:val="top"/>
-          </w:tcPr>
-          <w:p>
-            <w:pPr>
-              <w:spacing w:after="20" w:line="228" w:lineRule="auto"/>
-              <w:jc w:val="right"/>
-            </w:pPr>
-            <w:r>
-              <w:rPr>
-                <w:rFonts w:ascii="Arial" w:cs="Arial" w:eastAsia="Arial" w:hAnsi="Arial"/>
-                <w:b w:val="false"/>
-                <w:bCs w:val="false"/>
-                <w:i w:val="false"/>
-                <w:iCs w:val="false"/>
-                <w:caps w:val="false"/>
-                <w:color w:val="000000"/>
-                <w:sz w:val="16"/>
-                <w:szCs w:val="16"/>
-              </w:rPr>
-              <w:t xml:space="preserve">Nil</w:t>
-            </w:r>
-          </w:p>
-        </w:tc>
-      </w:tr>
-      <w:tr>
-        <w:tc>
-          <w:tcPr>
-            <w:tcW w:type="dxa" w:w="1150"/>
-            <w:tcMar>
-              <w:top w:type="dxa" w:w="50"/>
-              <w:left w:type="dxa" w:w="80"/>
-              <w:bottom w:type="dxa" w:w="30"/>
-              <w:right w:type="dxa" w:w="80"/>
-            </w:tcMar>
-            <w:vAlign w:val="top"/>
-          </w:tcPr>
-          <w:p>
-            <w:pPr>
-              <w:spacing w:after="20" w:line="228" w:lineRule="auto"/>
-              <w:jc w:val="left"/>
-            </w:pPr>
-            <w:r>
-              <w:rPr>
-                <w:rFonts w:ascii="Arial" w:cs="Arial" w:eastAsia="Arial" w:hAnsi="Arial"/>
-                <w:b/>
-                <w:bCs/>
-                <w:i w:val="false"/>
-                <w:iCs w:val="false"/>
-                <w:caps w:val="false"/>
-                <w:color w:val="000000"/>
-                <w:sz w:val="16"/>
-                <w:szCs w:val="16"/>
-              </w:rPr>
-              <w:t xml:space="preserve">3</w:t>
-            </w:r>
-          </w:p>
-        </w:tc>
-        <w:tc>
-          <w:tcPr>
-            <w:tcW w:type="dxa" w:w="3050"/>
-            <w:tcMar>
-              <w:top w:type="dxa" w:w="50"/>
-              <w:left w:type="dxa" w:w="80"/>
-              <w:bottom w:type="dxa" w:w="30"/>
-              <w:right w:type="dxa" w:w="80"/>
-            </w:tcMar>
-            <w:vAlign w:val="top"/>
-          </w:tcPr>
-          <w:p>
-            <w:pPr>
-              <w:spacing w:after="20" w:line="228" w:lineRule="auto"/>
-              <w:jc w:val="left"/>
-            </w:pPr>
-            <w:r>
-              <w:rPr>
-                <w:rFonts w:ascii="Arial" w:cs="Arial" w:eastAsia="Arial" w:hAnsi="Arial"/>
-                <w:b w:val="false"/>
-                <w:bCs w:val="false"/>
-                <w:i w:val="false"/>
-                <w:iCs w:val="false"/>
-                <w:caps w:val="false"/>
-                <w:color w:val="000000"/>
-                <w:sz w:val="16"/>
-                <w:szCs w:val="16"/>
-              </w:rPr>
-              <w:t xml:space="preserve">Cyprus finance company lending at arm’s length</w:t>
-            </w:r>
-          </w:p>
-        </w:tc>
-        <w:tc>
-          <w:tcPr>
-            <w:tcW w:type="dxa" w:w="1750"/>
-            <w:tcMar>
-              <w:top w:type="dxa" w:w="50"/>
-              <w:left w:type="dxa" w:w="80"/>
-              <w:bottom w:type="dxa" w:w="30"/>
-              <w:right w:type="dxa" w:w="80"/>
-            </w:tcMar>
-            <w:vAlign w:val="top"/>
-          </w:tcPr>
-          <w:p>
-            <w:pPr>
-              <w:spacing w:after="20" w:line="228" w:lineRule="auto"/>
-              <w:jc w:val="left"/>
-            </w:pPr>
-            <w:r>
-              <w:rPr>
-                <w:rFonts w:ascii="Arial" w:cs="Arial" w:eastAsia="Arial" w:hAnsi="Arial"/>
-                <w:b w:val="false"/>
-                <w:bCs w:val="false"/>
-                <w:i w:val="false"/>
-                <w:iCs w:val="false"/>
-                <w:caps w:val="false"/>
-                <w:color w:val="000000"/>
-                <w:sz w:val="16"/>
-                <w:szCs w:val="16"/>
-              </w:rPr>
-              <w:t xml:space="preserve">No</w:t>
-            </w:r>
-          </w:p>
-        </w:tc>
-        <w:tc>
-          <w:tcPr>
-            <w:tcW w:type="dxa" w:w="1900"/>
-            <w:tcMar>
-              <w:top w:type="dxa" w:w="50"/>
-              <w:left w:type="dxa" w:w="80"/>
-              <w:bottom w:type="dxa" w:w="30"/>
-              <w:right w:type="dxa" w:w="80"/>
-            </w:tcMar>
-            <w:vAlign w:val="top"/>
-          </w:tcPr>
-          <w:p>
-            <w:pPr>
-              <w:spacing w:after="20" w:line="228" w:lineRule="auto"/>
-              <w:jc w:val="left"/>
-            </w:pPr>
-            <w:r>
-              <w:rPr>
-                <w:rFonts w:ascii="Arial" w:cs="Arial" w:eastAsia="Arial" w:hAnsi="Arial"/>
-                <w:b w:val="false"/>
-                <w:bCs w:val="false"/>
-                <w:i w:val="false"/>
-                <w:iCs w:val="false"/>
-                <w:caps w:val="false"/>
-                <w:color w:val="000000"/>
-                <w:sz w:val="16"/>
-                <w:szCs w:val="16"/>
-              </w:rPr>
-              <w:t xml:space="preserve">At any time</w:t>
-            </w:r>
-          </w:p>
-        </w:tc>
-        <w:tc>
-          <w:tcPr>
-            <w:tcW w:type="dxa" w:w="1726"/>
             <w:tcMar>
               <w:top w:type="dxa" w:w="50"/>
               <w:left w:type="dxa" w:w="80"/>
@@ -1782,7 +1782,7 @@
           <w:sz w:val="18"/>
           <w:szCs w:val="18"/>
         </w:rPr>
-        <w:t xml:space="preserve">Structure 3, subject to the conditions on page 7: an arm’s length rate supported by a new transfer pricing study, consistent capitalisation of borrowing costs, Cyprus substance in the finance company, and evidenced source and sequence of funds. It is the only structure with a measurable tax benefit and the only one under which principal can be repaid and redeployed without a court application or distributable profits. It does not restore the balance sheet and does not place Starter Point on the register; if those objectives govern, structure 1A is the appropriate choice, and no tax benefit is foregone by selecting it.</w:t>
+        <w:t xml:space="preserve">Structure 3, subject to the conditions on pages 6 and 7: an arm’s length rate supported by a new transfer pricing study, consistent capitalisation of borrowing costs, Cyprus substance in the finance company, and evidenced source and sequence of funds. It is the only structure with a measurable tax benefit and the only one under which principal can be repaid and redeployed without a court application or distributable profits. It does not restore the balance sheet and does not place Starter Point on the register; if those objectives govern, structure 1A is the appropriate choice, and no tax benefit is foregone by selecting it.</w:t>
       </w:r>
     </w:p>
     <w:p>
@@ -1812,25 +1812,6 @@
     </w:p>
     <w:p>
       <w:pPr>
-        <w:spacing w:after="30"/>
-      </w:pPr>
-      <w:r>
-        <w:rPr>
-          <w:rFonts w:ascii="Arial" w:cs="Arial" w:eastAsia="Arial" w:hAnsi="Arial"/>
-          <w:b/>
-          <w:bCs/>
-          <w:i w:val="false"/>
-          <w:iCs w:val="false"/>
-          <w:caps w:val="false"/>
-          <w:color w:val="000000"/>
-          <w:sz w:val="27"/>
-          <w:szCs w:val="27"/>
-        </w:rPr>
-        <w:t xml:space="preserve">Ordinary shares issued at a premium</w:t>
-      </w:r>
-    </w:p>
-    <w:p>
-      <w:pPr>
         <w:pBdr>
           <w:bottom w:val="single" w:color="000000" w:sz="6" w:space="4"/>
         </w:pBdr>
@@ -1839,16 +1820,16 @@
       <w:r>
         <w:rPr>
           <w:rFonts w:ascii="Arial" w:cs="Arial" w:eastAsia="Arial" w:hAnsi="Arial"/>
-          <w:b w:val="false"/>
-          <w:bCs w:val="false"/>
-          <w:i/>
-          <w:iCs/>
-          <w:caps w:val="false"/>
-          <w:color w:val="595959"/>
-          <w:sz w:val="19"/>
-          <w:szCs w:val="19"/>
-        </w:rPr>
-        <w:t xml:space="preserve">Subscription for ordinary shares, restoring net assets and delivering the agreed shareholding structure</w:t>
+          <w:b/>
+          <w:bCs/>
+          <w:i w:val="false"/>
+          <w:iCs w:val="false"/>
+          <w:caps w:val="false"/>
+          <w:color w:val="000000"/>
+          <w:sz w:val="27"/>
+          <w:szCs w:val="27"/>
+        </w:rPr>
+        <w:t xml:space="preserve">Ordinary shares issued at a premium</w:t>
       </w:r>
     </w:p>
     <w:p>
@@ -1894,7 +1875,7 @@
     </w:p>
     <w:tbl>
       <w:tblPr>
-        <w:tblW w:type="dxa" w:w="9576"/>
+        <w:tblW w:type="dxa" w:w="9750"/>
         <w:tblBorders>
           <w:top w:val="single" w:color="000000" w:sz="8"/>
           <w:left w:val="none"/>
@@ -1905,11 +1886,11 @@
         </w:tblBorders>
       </w:tblPr>
       <w:tblGrid>
-        <w:gridCol w:w="2650"/>
-        <w:gridCol w:w="1500"/>
-        <w:gridCol w:w="1400"/>
-        <w:gridCol w:w="1700"/>
-        <w:gridCol w:w="2326"/>
+        <w:gridCol w:w="2700"/>
+        <w:gridCol w:w="1530"/>
+        <w:gridCol w:w="1430"/>
+        <w:gridCol w:w="1730"/>
+        <w:gridCol w:w="2360"/>
       </w:tblGrid>
       <w:tr>
         <w:trPr>
@@ -1917,7 +1898,7 @@
         </w:trPr>
         <w:tc>
           <w:tcPr>
-            <w:tcW w:type="dxa" w:w="2650"/>
+            <w:tcW w:type="dxa" w:w="2700"/>
             <w:shd w:fill="F2F2F2" w:val="clear"/>
             <w:tcMar>
               <w:top w:type="dxa" w:w="50"/>
@@ -1950,7 +1931,7 @@
         </w:tc>
         <w:tc>
           <w:tcPr>
-            <w:tcW w:type="dxa" w:w="1500"/>
+            <w:tcW w:type="dxa" w:w="1530"/>
             <w:shd w:fill="F2F2F2" w:val="clear"/>
             <w:tcMar>
               <w:top w:type="dxa" w:w="50"/>
@@ -1983,7 +1964,7 @@
         </w:tc>
         <w:tc>
           <w:tcPr>
-            <w:tcW w:type="dxa" w:w="1400"/>
+            <w:tcW w:type="dxa" w:w="1430"/>
             <w:shd w:fill="F2F2F2" w:val="clear"/>
             <w:tcMar>
               <w:top w:type="dxa" w:w="50"/>
@@ -2016,7 +1997,7 @@
         </w:tc>
         <w:tc>
           <w:tcPr>
-            <w:tcW w:type="dxa" w:w="1700"/>
+            <w:tcW w:type="dxa" w:w="1730"/>
             <w:shd w:fill="F2F2F2" w:val="clear"/>
             <w:tcMar>
               <w:top w:type="dxa" w:w="50"/>
@@ -2049,7 +2030,7 @@
         </w:tc>
         <w:tc>
           <w:tcPr>
-            <w:tcW w:type="dxa" w:w="2326"/>
+            <w:tcW w:type="dxa" w:w="2360"/>
             <w:shd w:fill="F2F2F2" w:val="clear"/>
             <w:tcMar>
               <w:top w:type="dxa" w:w="50"/>
@@ -2084,7 +2065,7 @@
       <w:tr>
         <w:tc>
           <w:tcPr>
-            <w:tcW w:type="dxa" w:w="2650"/>
+            <w:tcW w:type="dxa" w:w="2700"/>
             <w:tcMar>
               <w:top w:type="dxa" w:w="50"/>
               <w:left w:type="dxa" w:w="80"/>
@@ -2116,7 +2097,7 @@
         </w:tc>
         <w:tc>
           <w:tcPr>
-            <w:tcW w:type="dxa" w:w="1500"/>
+            <w:tcW w:type="dxa" w:w="1530"/>
             <w:tcMar>
               <w:top w:type="dxa" w:w="50"/>
               <w:left w:type="dxa" w:w="80"/>
@@ -2148,7 +2129,7 @@
         </w:tc>
         <w:tc>
           <w:tcPr>
-            <w:tcW w:type="dxa" w:w="1400"/>
+            <w:tcW w:type="dxa" w:w="1430"/>
             <w:tcMar>
               <w:top w:type="dxa" w:w="50"/>
               <w:left w:type="dxa" w:w="80"/>
@@ -2180,7 +2161,7 @@
         </w:tc>
         <w:tc>
           <w:tcPr>
-            <w:tcW w:type="dxa" w:w="1700"/>
+            <w:tcW w:type="dxa" w:w="1730"/>
             <w:tcMar>
               <w:top w:type="dxa" w:w="50"/>
               <w:left w:type="dxa" w:w="80"/>
@@ -2212,7 +2193,7 @@
         </w:tc>
         <w:tc>
           <w:tcPr>
-            <w:tcW w:type="dxa" w:w="2326"/>
+            <w:tcW w:type="dxa" w:w="2360"/>
             <w:tcMar>
               <w:top w:type="dxa" w:w="50"/>
               <w:left w:type="dxa" w:w="80"/>
@@ -2246,7 +2227,7 @@
       <w:tr>
         <w:tc>
           <w:tcPr>
-            <w:tcW w:type="dxa" w:w="2650"/>
+            <w:tcW w:type="dxa" w:w="2700"/>
             <w:tcMar>
               <w:top w:type="dxa" w:w="50"/>
               <w:left w:type="dxa" w:w="80"/>
@@ -2278,7 +2259,7 @@
         </w:tc>
         <w:tc>
           <w:tcPr>
-            <w:tcW w:type="dxa" w:w="1500"/>
+            <w:tcW w:type="dxa" w:w="1530"/>
             <w:tcMar>
               <w:top w:type="dxa" w:w="50"/>
               <w:left w:type="dxa" w:w="80"/>
@@ -2310,7 +2291,7 @@
         </w:tc>
         <w:tc>
           <w:tcPr>
-            <w:tcW w:type="dxa" w:w="1400"/>
+            <w:tcW w:type="dxa" w:w="1430"/>
             <w:tcMar>
               <w:top w:type="dxa" w:w="50"/>
               <w:left w:type="dxa" w:w="80"/>
@@ -2342,7 +2323,7 @@
         </w:tc>
         <w:tc>
           <w:tcPr>
-            <w:tcW w:type="dxa" w:w="1700"/>
+            <w:tcW w:type="dxa" w:w="1730"/>
             <w:tcMar>
               <w:top w:type="dxa" w:w="50"/>
               <w:left w:type="dxa" w:w="80"/>
@@ -2374,7 +2355,7 @@
         </w:tc>
         <w:tc>
           <w:tcPr>
-            <w:tcW w:type="dxa" w:w="2326"/>
+            <w:tcW w:type="dxa" w:w="2360"/>
             <w:tcMar>
               <w:top w:type="dxa" w:w="50"/>
               <w:left w:type="dxa" w:w="80"/>
@@ -2408,7 +2389,7 @@
       <w:tr>
         <w:tc>
           <w:tcPr>
-            <w:tcW w:type="dxa" w:w="2650"/>
+            <w:tcW w:type="dxa" w:w="2700"/>
             <w:tcMar>
               <w:top w:type="dxa" w:w="50"/>
               <w:left w:type="dxa" w:w="80"/>
@@ -2440,7 +2421,7 @@
         </w:tc>
         <w:tc>
           <w:tcPr>
-            <w:tcW w:type="dxa" w:w="1500"/>
+            <w:tcW w:type="dxa" w:w="1530"/>
             <w:tcMar>
               <w:top w:type="dxa" w:w="50"/>
               <w:left w:type="dxa" w:w="80"/>
@@ -2472,7 +2453,7 @@
         </w:tc>
         <w:tc>
           <w:tcPr>
-            <w:tcW w:type="dxa" w:w="1400"/>
+            <w:tcW w:type="dxa" w:w="1430"/>
             <w:tcMar>
               <w:top w:type="dxa" w:w="50"/>
               <w:left w:type="dxa" w:w="80"/>
@@ -2504,7 +2485,7 @@
         </w:tc>
         <w:tc>
           <w:tcPr>
-            <w:tcW w:type="dxa" w:w="1700"/>
+            <w:tcW w:type="dxa" w:w="1730"/>
             <w:tcMar>
               <w:top w:type="dxa" w:w="50"/>
               <w:left w:type="dxa" w:w="80"/>
@@ -2536,7 +2517,7 @@
         </w:tc>
         <w:tc>
           <w:tcPr>
-            <w:tcW w:type="dxa" w:w="2326"/>
+            <w:tcW w:type="dxa" w:w="2360"/>
             <w:tcMar>
               <w:top w:type="dxa" w:w="50"/>
               <w:left w:type="dxa" w:w="80"/>
@@ -2570,7 +2551,7 @@
       <w:tr>
         <w:tc>
           <w:tcPr>
-            <w:tcW w:type="dxa" w:w="2650"/>
+            <w:tcW w:type="dxa" w:w="2700"/>
             <w:tcMar>
               <w:top w:type="dxa" w:w="50"/>
               <w:left w:type="dxa" w:w="80"/>
@@ -2602,7 +2583,7 @@
         </w:tc>
         <w:tc>
           <w:tcPr>
-            <w:tcW w:type="dxa" w:w="1500"/>
+            <w:tcW w:type="dxa" w:w="1530"/>
             <w:tcMar>
               <w:top w:type="dxa" w:w="50"/>
               <w:left w:type="dxa" w:w="80"/>
@@ -2634,7 +2615,7 @@
         </w:tc>
         <w:tc>
           <w:tcPr>
-            <w:tcW w:type="dxa" w:w="1400"/>
+            <w:tcW w:type="dxa" w:w="1430"/>
             <w:tcMar>
               <w:top w:type="dxa" w:w="50"/>
               <w:left w:type="dxa" w:w="80"/>
@@ -2666,7 +2647,7 @@
         </w:tc>
         <w:tc>
           <w:tcPr>
-            <w:tcW w:type="dxa" w:w="1700"/>
+            <w:tcW w:type="dxa" w:w="1730"/>
             <w:tcMar>
               <w:top w:type="dxa" w:w="50"/>
               <w:left w:type="dxa" w:w="80"/>
@@ -2698,7 +2679,7 @@
         </w:tc>
         <w:tc>
           <w:tcPr>
-            <w:tcW w:type="dxa" w:w="2326"/>
+            <w:tcW w:type="dxa" w:w="2360"/>
             <w:tcMar>
               <w:top w:type="dxa" w:w="50"/>
               <w:left w:type="dxa" w:w="80"/>
@@ -2773,7 +2754,7 @@
     </w:p>
     <w:tbl>
       <w:tblPr>
-        <w:tblW w:type="dxa" w:w="9576"/>
+        <w:tblW w:type="dxa" w:w="9750"/>
         <w:tblBorders>
           <w:top w:val="single" w:color="000000" w:sz="8"/>
           <w:left w:val="none"/>
@@ -2785,7 +2766,7 @@
       </w:tblPr>
       <w:tblGrid>
         <w:gridCol w:w="2350"/>
-        <w:gridCol w:w="7226"/>
+        <w:gridCol w:w="7400"/>
       </w:tblGrid>
       <w:tr>
         <w:tc>
@@ -2822,7 +2803,7 @@
         </w:tc>
         <w:tc>
           <w:tcPr>
-            <w:tcW w:type="dxa" w:w="7226"/>
+            <w:tcW w:type="dxa" w:w="7400"/>
             <w:tcMar>
               <w:top w:type="dxa" w:w="50"/>
               <w:left w:type="dxa" w:w="80"/>
@@ -2888,7 +2869,7 @@
         </w:tc>
         <w:tc>
           <w:tcPr>
-            <w:tcW w:type="dxa" w:w="7226"/>
+            <w:tcW w:type="dxa" w:w="7400"/>
             <w:tcMar>
               <w:top w:type="dxa" w:w="50"/>
               <w:left w:type="dxa" w:w="80"/>
@@ -2954,7 +2935,7 @@
         </w:tc>
         <w:tc>
           <w:tcPr>
-            <w:tcW w:type="dxa" w:w="7226"/>
+            <w:tcW w:type="dxa" w:w="7400"/>
             <w:tcMar>
               <w:top w:type="dxa" w:w="50"/>
               <w:left w:type="dxa" w:w="80"/>
@@ -3020,7 +3001,7 @@
         </w:tc>
         <w:tc>
           <w:tcPr>
-            <w:tcW w:type="dxa" w:w="7226"/>
+            <w:tcW w:type="dxa" w:w="7400"/>
             <w:tcMar>
               <w:top w:type="dxa" w:w="50"/>
               <w:left w:type="dxa" w:w="80"/>
@@ -3086,33 +3067,33 @@
         </w:tc>
         <w:tc>
           <w:tcPr>
-            <w:tcW w:type="dxa" w:w="7226"/>
-            <w:tcMar>
-              <w:top w:type="dxa" w:w="50"/>
-              <w:left w:type="dxa" w:w="80"/>
-              <w:bottom w:type="dxa" w:w="30"/>
-              <w:right w:type="dxa" w:w="80"/>
-            </w:tcMar>
-            <w:vAlign w:val="top"/>
-          </w:tcPr>
-          <w:p>
-            <w:pPr>
-              <w:spacing w:after="20" w:line="228" w:lineRule="auto"/>
-              <w:jc w:val="left"/>
-            </w:pPr>
-            <w:r>
-              <w:rPr>
-                <w:rFonts w:ascii="Arial" w:cs="Arial" w:eastAsia="Arial" w:hAnsi="Arial"/>
-                <w:b w:val="false"/>
-                <w:bCs w:val="false"/>
-                <w:i w:val="false"/>
-                <w:iCs w:val="false"/>
-                <w:caps w:val="false"/>
-                <w:color w:val="000000"/>
-                <w:sz w:val="16"/>
-                <w:szCs w:val="16"/>
-              </w:rPr>
-              <w:t xml:space="preserve">The bonus issue increases the minority holders’ combined 10% from a share of negative equity to approximately €1,6m of net assets, funded from the subscription premium. This is a direct consequence of the 80/10/5/5 objective rather than a defect of the structure. Because the bonus shares are paid up from share premium, and not from reserves available for distribution, the 2026 provision treating capitalisations of distributable reserves as dividends should not apply; this is to be confirmed before the resolutions are drafted.</w:t>
+            <w:tcW w:type="dxa" w:w="7400"/>
+            <w:tcMar>
+              <w:top w:type="dxa" w:w="50"/>
+              <w:left w:type="dxa" w:w="80"/>
+              <w:bottom w:type="dxa" w:w="30"/>
+              <w:right w:type="dxa" w:w="80"/>
+            </w:tcMar>
+            <w:vAlign w:val="top"/>
+          </w:tcPr>
+          <w:p>
+            <w:pPr>
+              <w:spacing w:after="20" w:line="228" w:lineRule="auto"/>
+              <w:jc w:val="left"/>
+            </w:pPr>
+            <w:r>
+              <w:rPr>
+                <w:rFonts w:ascii="Arial" w:cs="Arial" w:eastAsia="Arial" w:hAnsi="Arial"/>
+                <w:b w:val="false"/>
+                <w:bCs w:val="false"/>
+                <w:i w:val="false"/>
+                <w:iCs w:val="false"/>
+                <w:caps w:val="false"/>
+                <w:color w:val="000000"/>
+                <w:sz w:val="16"/>
+                <w:szCs w:val="16"/>
+              </w:rPr>
+              <w:t xml:space="preserve">The bonus issue increases the minority holders’ combined 10% from a share of negative equity to approximately €1,6m of net assets, funded from the subscription premium. This is the direct consequence of the 80/10/5/5 objective and should be accepted as part of its cost. Because the bonus shares are paid up from share premium, and not from reserves available for distribution, the 2026 provision treating capitalisations of distributable reserves as dividends should not apply; this is to be confirmed before the resolutions are drafted.</w:t>
             </w:r>
           </w:p>
         </w:tc>
@@ -3152,7 +3133,7 @@
         </w:tc>
         <w:tc>
           <w:tcPr>
-            <w:tcW w:type="dxa" w:w="7226"/>
+            <w:tcW w:type="dxa" w:w="7400"/>
             <w:tcMar>
               <w:top w:type="dxa" w:w="50"/>
               <w:left w:type="dxa" w:w="80"/>
@@ -3249,25 +3230,6 @@
     </w:p>
     <w:p>
       <w:pPr>
-        <w:spacing w:after="30"/>
-      </w:pPr>
-      <w:r>
-        <w:rPr>
-          <w:rFonts w:ascii="Arial" w:cs="Arial" w:eastAsia="Arial" w:hAnsi="Arial"/>
-          <w:b/>
-          <w:bCs/>
-          <w:i w:val="false"/>
-          <w:iCs w:val="false"/>
-          <w:caps w:val="false"/>
-          <w:color w:val="000000"/>
-          <w:sz w:val="27"/>
-          <w:szCs w:val="27"/>
-        </w:rPr>
-        <w:t xml:space="preserve">Redeemable preference shares with a discretionary, non-cumulative dividend</w:t>
-      </w:r>
-    </w:p>
-    <w:p>
-      <w:pPr>
         <w:pBdr>
           <w:bottom w:val="single" w:color="000000" w:sz="6" w:space="4"/>
         </w:pBdr>
@@ -3276,16 +3238,16 @@
       <w:r>
         <w:rPr>
           <w:rFonts w:ascii="Arial" w:cs="Arial" w:eastAsia="Arial" w:hAnsi="Arial"/>
-          <w:b w:val="false"/>
-          <w:bCs w:val="false"/>
-          <w:i/>
-          <w:iCs/>
-          <w:caps w:val="false"/>
-          <w:color w:val="595959"/>
-          <w:sz w:val="19"/>
-          <w:szCs w:val="19"/>
-        </w:rPr>
-        <w:t xml:space="preserve">Equity classification preserved, with redemption available once distributable profits arise</w:t>
+          <w:b/>
+          <w:bCs/>
+          <w:i w:val="false"/>
+          <w:iCs w:val="false"/>
+          <w:caps w:val="false"/>
+          <w:color w:val="000000"/>
+          <w:sz w:val="27"/>
+          <w:szCs w:val="27"/>
+        </w:rPr>
+        <w:t xml:space="preserve">Redeemable preference shares with a discretionary, non-cumulative dividend</w:t>
       </w:r>
     </w:p>
     <w:p>
@@ -3351,7 +3313,7 @@
     </w:p>
     <w:tbl>
       <w:tblPr>
-        <w:tblW w:type="dxa" w:w="9576"/>
+        <w:tblW w:type="dxa" w:w="9750"/>
         <w:tblBorders>
           <w:top w:val="single" w:color="000000" w:sz="8"/>
           <w:left w:val="none"/>
@@ -3363,7 +3325,7 @@
       </w:tblPr>
       <w:tblGrid>
         <w:gridCol w:w="2350"/>
-        <w:gridCol w:w="7226"/>
+        <w:gridCol w:w="7400"/>
       </w:tblGrid>
       <w:tr>
         <w:tc>
@@ -3400,7 +3362,7 @@
         </w:tc>
         <w:tc>
           <w:tcPr>
-            <w:tcW w:type="dxa" w:w="7226"/>
+            <w:tcW w:type="dxa" w:w="7400"/>
             <w:tcMar>
               <w:top w:type="dxa" w:w="50"/>
               <w:left w:type="dxa" w:w="80"/>
@@ -3466,7 +3428,7 @@
         </w:tc>
         <w:tc>
           <w:tcPr>
-            <w:tcW w:type="dxa" w:w="7226"/>
+            <w:tcW w:type="dxa" w:w="7400"/>
             <w:tcMar>
               <w:top w:type="dxa" w:w="50"/>
               <w:left w:type="dxa" w:w="80"/>
@@ -3532,7 +3494,7 @@
         </w:tc>
         <w:tc>
           <w:tcPr>
-            <w:tcW w:type="dxa" w:w="7226"/>
+            <w:tcW w:type="dxa" w:w="7400"/>
             <w:tcMar>
               <w:top w:type="dxa" w:w="50"/>
               <w:left w:type="dxa" w:w="80"/>
@@ -3598,7 +3560,7 @@
         </w:tc>
         <w:tc>
           <w:tcPr>
-            <w:tcW w:type="dxa" w:w="7226"/>
+            <w:tcW w:type="dxa" w:w="7400"/>
             <w:tcMar>
               <w:top w:type="dxa" w:w="50"/>
               <w:left w:type="dxa" w:w="80"/>
@@ -3664,7 +3626,7 @@
         </w:tc>
         <w:tc>
           <w:tcPr>
-            <w:tcW w:type="dxa" w:w="7226"/>
+            <w:tcW w:type="dxa" w:w="7400"/>
             <w:tcMar>
               <w:top w:type="dxa" w:w="50"/>
               <w:left w:type="dxa" w:w="80"/>
@@ -3730,7 +3692,7 @@
         </w:tc>
         <w:tc>
           <w:tcPr>
-            <w:tcW w:type="dxa" w:w="7226"/>
+            <w:tcW w:type="dxa" w:w="7400"/>
             <w:tcMar>
               <w:top w:type="dxa" w:w="50"/>
               <w:left w:type="dxa" w:w="80"/>
@@ -3827,25 +3789,6 @@
     </w:p>
     <w:p>
       <w:pPr>
-        <w:spacing w:after="30"/>
-      </w:pPr>
-      <w:r>
-        <w:rPr>
-          <w:rFonts w:ascii="Arial" w:cs="Arial" w:eastAsia="Arial" w:hAnsi="Arial"/>
-          <w:b/>
-          <w:bCs/>
-          <w:i w:val="false"/>
-          <w:iCs w:val="false"/>
-          <w:caps w:val="false"/>
-          <w:color w:val="000000"/>
-          <w:sz w:val="27"/>
-          <w:szCs w:val="27"/>
-        </w:rPr>
-        <w:t xml:space="preserve">Preference shares with a fixed or cumulative entitlement</w:t>
-      </w:r>
-    </w:p>
-    <w:p>
-      <w:pPr>
         <w:pBdr>
           <w:bottom w:val="single" w:color="000000" w:sz="6" w:space="4"/>
         </w:pBdr>
@@ -3854,16 +3797,16 @@
       <w:r>
         <w:rPr>
           <w:rFonts w:ascii="Arial" w:cs="Arial" w:eastAsia="Arial" w:hAnsi="Arial"/>
-          <w:b w:val="false"/>
-          <w:bCs w:val="false"/>
-          <w:i/>
-          <w:iCs/>
-          <w:caps w:val="false"/>
-          <w:color w:val="595959"/>
-          <w:sz w:val="19"/>
-          <w:szCs w:val="19"/>
-        </w:rPr>
-        <w:t xml:space="preserve">The structure as originally discussed; classified as a financial liability under IAS 32</w:t>
+          <w:b/>
+          <w:bCs/>
+          <w:i w:val="false"/>
+          <w:iCs w:val="false"/>
+          <w:caps w:val="false"/>
+          <w:color w:val="000000"/>
+          <w:sz w:val="27"/>
+          <w:szCs w:val="27"/>
+        </w:rPr>
+        <w:t xml:space="preserve">Preference shares with a fixed or cumulative entitlement</w:t>
       </w:r>
     </w:p>
     <w:p>
@@ -3929,7 +3872,7 @@
     </w:p>
     <w:tbl>
       <w:tblPr>
-        <w:tblW w:type="dxa" w:w="9576"/>
+        <w:tblW w:type="dxa" w:w="9750"/>
         <w:tblBorders>
           <w:top w:val="single" w:color="000000" w:sz="8"/>
           <w:left w:val="none"/>
@@ -3941,7 +3884,7 @@
       </w:tblPr>
       <w:tblGrid>
         <w:gridCol w:w="2350"/>
-        <w:gridCol w:w="7226"/>
+        <w:gridCol w:w="7400"/>
       </w:tblGrid>
       <w:tr>
         <w:tc>
@@ -3978,7 +3921,7 @@
         </w:tc>
         <w:tc>
           <w:tcPr>
-            <w:tcW w:type="dxa" w:w="7226"/>
+            <w:tcW w:type="dxa" w:w="7400"/>
             <w:tcMar>
               <w:top w:type="dxa" w:w="50"/>
               <w:left w:type="dxa" w:w="80"/>
@@ -4044,7 +3987,7 @@
         </w:tc>
         <w:tc>
           <w:tcPr>
-            <w:tcW w:type="dxa" w:w="7226"/>
+            <w:tcW w:type="dxa" w:w="7400"/>
             <w:tcMar>
               <w:top w:type="dxa" w:w="50"/>
               <w:left w:type="dxa" w:w="80"/>
@@ -4110,7 +4053,7 @@
         </w:tc>
         <w:tc>
           <w:tcPr>
-            <w:tcW w:type="dxa" w:w="7226"/>
+            <w:tcW w:type="dxa" w:w="7400"/>
             <w:tcMar>
               <w:top w:type="dxa" w:w="50"/>
               <w:left w:type="dxa" w:w="80"/>
@@ -4176,7 +4119,7 @@
         </w:tc>
         <w:tc>
           <w:tcPr>
-            <w:tcW w:type="dxa" w:w="7226"/>
+            <w:tcW w:type="dxa" w:w="7400"/>
             <w:tcMar>
               <w:top w:type="dxa" w:w="50"/>
               <w:left w:type="dxa" w:w="80"/>
@@ -4242,7 +4185,7 @@
         </w:tc>
         <w:tc>
           <w:tcPr>
-            <w:tcW w:type="dxa" w:w="7226"/>
+            <w:tcW w:type="dxa" w:w="7400"/>
             <w:tcMar>
               <w:top w:type="dxa" w:w="50"/>
               <w:left w:type="dxa" w:w="80"/>
@@ -4380,25 +4323,6 @@
     </w:p>
     <w:p>
       <w:pPr>
-        <w:spacing w:after="30"/>
-      </w:pPr>
-      <w:r>
-        <w:rPr>
-          <w:rFonts w:ascii="Arial" w:cs="Arial" w:eastAsia="Arial" w:hAnsi="Arial"/>
-          <w:b/>
-          <w:bCs/>
-          <w:i w:val="false"/>
-          <w:iCs w:val="false"/>
-          <w:caps w:val="false"/>
-          <w:color w:val="000000"/>
-          <w:sz w:val="27"/>
-          <w:szCs w:val="27"/>
-        </w:rPr>
-        <w:t xml:space="preserve">Cyprus holding company subscribing equity</w:t>
-      </w:r>
-    </w:p>
-    <w:p>
-      <w:pPr>
         <w:pBdr>
           <w:bottom w:val="single" w:color="000000" w:sz="6" w:space="4"/>
         </w:pBdr>
@@ -4407,16 +4331,16 @@
       <w:r>
         <w:rPr>
           <w:rFonts w:ascii="Arial" w:cs="Arial" w:eastAsia="Arial" w:hAnsi="Arial"/>
-          <w:b w:val="false"/>
-          <w:bCs w:val="false"/>
-          <w:i/>
-          <w:iCs/>
-          <w:caps w:val="false"/>
-          <w:color w:val="595959"/>
-          <w:sz w:val="19"/>
-          <w:szCs w:val="19"/>
-        </w:rPr>
-        <w:t xml:space="preserve">The same instrument, subscribed through an intermediate Cyprus holding company</w:t>
+          <w:b/>
+          <w:bCs/>
+          <w:i w:val="false"/>
+          <w:iCs w:val="false"/>
+          <w:caps w:val="false"/>
+          <w:color w:val="000000"/>
+          <w:sz w:val="27"/>
+          <w:szCs w:val="27"/>
+        </w:rPr>
+        <w:t xml:space="preserve">Cyprus holding company subscribing equity</w:t>
       </w:r>
     </w:p>
     <w:p>
@@ -4482,7 +4406,7 @@
     </w:p>
     <w:tbl>
       <w:tblPr>
-        <w:tblW w:type="dxa" w:w="9576"/>
+        <w:tblW w:type="dxa" w:w="9750"/>
         <w:tblBorders>
           <w:top w:val="single" w:color="000000" w:sz="8"/>
           <w:left w:val="none"/>
@@ -4494,7 +4418,7 @@
       </w:tblPr>
       <w:tblGrid>
         <w:gridCol w:w="2350"/>
-        <w:gridCol w:w="7226"/>
+        <w:gridCol w:w="7400"/>
       </w:tblGrid>
       <w:tr>
         <w:tc>
@@ -4531,7 +4455,7 @@
         </w:tc>
         <w:tc>
           <w:tcPr>
-            <w:tcW w:type="dxa" w:w="7226"/>
+            <w:tcW w:type="dxa" w:w="7400"/>
             <w:tcMar>
               <w:top w:type="dxa" w:w="50"/>
               <w:left w:type="dxa" w:w="80"/>
@@ -4597,7 +4521,7 @@
         </w:tc>
         <w:tc>
           <w:tcPr>
-            <w:tcW w:type="dxa" w:w="7226"/>
+            <w:tcW w:type="dxa" w:w="7400"/>
             <w:tcMar>
               <w:top w:type="dxa" w:w="50"/>
               <w:left w:type="dxa" w:w="80"/>
@@ -4663,7 +4587,7 @@
         </w:tc>
         <w:tc>
           <w:tcPr>
-            <w:tcW w:type="dxa" w:w="7226"/>
+            <w:tcW w:type="dxa" w:w="7400"/>
             <w:tcMar>
               <w:top w:type="dxa" w:w="50"/>
               <w:left w:type="dxa" w:w="80"/>
@@ -4729,7 +4653,7 @@
         </w:tc>
         <w:tc>
           <w:tcPr>
-            <w:tcW w:type="dxa" w:w="7226"/>
+            <w:tcW w:type="dxa" w:w="7400"/>
             <w:tcMar>
               <w:top w:type="dxa" w:w="50"/>
               <w:left w:type="dxa" w:w="80"/>
@@ -4795,7 +4719,7 @@
         </w:tc>
         <w:tc>
           <w:tcPr>
-            <w:tcW w:type="dxa" w:w="7226"/>
+            <w:tcW w:type="dxa" w:w="7400"/>
             <w:tcMar>
               <w:top w:type="dxa" w:w="50"/>
               <w:left w:type="dxa" w:w="80"/>
@@ -4861,7 +4785,7 @@
         </w:tc>
         <w:tc>
           <w:tcPr>
-            <w:tcW w:type="dxa" w:w="7226"/>
+            <w:tcW w:type="dxa" w:w="7400"/>
             <w:tcMar>
               <w:top w:type="dxa" w:w="50"/>
               <w:left w:type="dxa" w:w="80"/>
@@ -4999,25 +4923,6 @@
     </w:p>
     <w:p>
       <w:pPr>
-        <w:spacing w:after="30"/>
-      </w:pPr>
-      <w:r>
-        <w:rPr>
-          <w:rFonts w:ascii="Arial" w:cs="Arial" w:eastAsia="Arial" w:hAnsi="Arial"/>
-          <w:b/>
-          <w:bCs/>
-          <w:i w:val="false"/>
-          <w:iCs w:val="false"/>
-          <w:caps w:val="false"/>
-          <w:color w:val="000000"/>
-          <w:sz w:val="27"/>
-          <w:szCs w:val="27"/>
-        </w:rPr>
-        <w:t xml:space="preserve">Cyprus finance company lending to Keytree</w:t>
-      </w:r>
-    </w:p>
-    <w:p>
-      <w:pPr>
         <w:pBdr>
           <w:bottom w:val="single" w:color="000000" w:sz="6" w:space="4"/>
         </w:pBdr>
@@ -5026,16 +4931,16 @@
       <w:r>
         <w:rPr>
           <w:rFonts w:ascii="Arial" w:cs="Arial" w:eastAsia="Arial" w:hAnsi="Arial"/>
-          <w:b w:val="false"/>
-          <w:bCs w:val="false"/>
-          <w:i/>
-          <w:iCs/>
-          <w:caps w:val="false"/>
-          <w:color w:val="595959"/>
-          <w:sz w:val="19"/>
-          <w:szCs w:val="19"/>
-        </w:rPr>
-        <w:t xml:space="preserve">Debt funding through a Cyprus finance company at an arm’s length rate</w:t>
+          <w:b/>
+          <w:bCs/>
+          <w:i w:val="false"/>
+          <w:iCs w:val="false"/>
+          <w:caps w:val="false"/>
+          <w:color w:val="000000"/>
+          <w:sz w:val="27"/>
+          <w:szCs w:val="27"/>
+        </w:rPr>
+        <w:t xml:space="preserve">Cyprus finance company lending to Keytree</w:t>
       </w:r>
     </w:p>
     <w:p>
@@ -5101,7 +5006,7 @@
     </w:p>
     <w:tbl>
       <w:tblPr>
-        <w:tblW w:type="dxa" w:w="7800"/>
+        <w:tblW w:type="dxa" w:w="9750"/>
         <w:tblBorders>
           <w:top w:val="single" w:color="000000" w:sz="8"/>
           <w:left w:val="none"/>
@@ -5112,9 +5017,9 @@
         </w:tblBorders>
       </w:tblPr>
       <w:tblGrid>
-        <w:gridCol w:w="3200"/>
-        <w:gridCol w:w="2300"/>
-        <w:gridCol w:w="2300"/>
+        <w:gridCol w:w="4550"/>
+        <w:gridCol w:w="2600"/>
+        <w:gridCol w:w="2600"/>
       </w:tblGrid>
       <w:tr>
         <w:trPr>
@@ -5122,7 +5027,7 @@
         </w:trPr>
         <w:tc>
           <w:tcPr>
-            <w:tcW w:type="dxa" w:w="3200"/>
+            <w:tcW w:type="dxa" w:w="4550"/>
             <w:shd w:fill="F2F2F2" w:val="clear"/>
             <w:tcMar>
               <w:top w:type="dxa" w:w="50"/>
@@ -5155,7 +5060,7 @@
         </w:tc>
         <w:tc>
           <w:tcPr>
-            <w:tcW w:type="dxa" w:w="2300"/>
+            <w:tcW w:type="dxa" w:w="2600"/>
             <w:shd w:fill="F2F2F2" w:val="clear"/>
             <w:tcMar>
               <w:top w:type="dxa" w:w="50"/>
@@ -5188,7 +5093,7 @@
         </w:tc>
         <w:tc>
           <w:tcPr>
-            <w:tcW w:type="dxa" w:w="2300"/>
+            <w:tcW w:type="dxa" w:w="2600"/>
             <w:shd w:fill="F2F2F2" w:val="clear"/>
             <w:tcMar>
               <w:top w:type="dxa" w:w="50"/>
@@ -5223,7 +5128,7 @@
       <w:tr>
         <w:tc>
           <w:tcPr>
-            <w:tcW w:type="dxa" w:w="3200"/>
+            <w:tcW w:type="dxa" w:w="4550"/>
             <w:tcMar>
               <w:top w:type="dxa" w:w="50"/>
               <w:left w:type="dxa" w:w="80"/>
@@ -5255,7 +5160,7 @@
         </w:tc>
         <w:tc>
           <w:tcPr>
-            <w:tcW w:type="dxa" w:w="2300"/>
+            <w:tcW w:type="dxa" w:w="2600"/>
             <w:tcMar>
               <w:top w:type="dxa" w:w="50"/>
               <w:left w:type="dxa" w:w="80"/>
@@ -5287,7 +5192,7 @@
         </w:tc>
         <w:tc>
           <w:tcPr>
-            <w:tcW w:type="dxa" w:w="2300"/>
+            <w:tcW w:type="dxa" w:w="2600"/>
             <w:tcMar>
               <w:top w:type="dxa" w:w="50"/>
               <w:left w:type="dxa" w:w="80"/>
@@ -5321,7 +5226,7 @@
       <w:tr>
         <w:tc>
           <w:tcPr>
-            <w:tcW w:type="dxa" w:w="3200"/>
+            <w:tcW w:type="dxa" w:w="4550"/>
             <w:tcMar>
               <w:top w:type="dxa" w:w="50"/>
               <w:left w:type="dxa" w:w="80"/>
@@ -5353,7 +5258,7 @@
         </w:tc>
         <w:tc>
           <w:tcPr>
-            <w:tcW w:type="dxa" w:w="2300"/>
+            <w:tcW w:type="dxa" w:w="2600"/>
             <w:tcMar>
               <w:top w:type="dxa" w:w="50"/>
               <w:left w:type="dxa" w:w="80"/>
@@ -5385,7 +5290,7 @@
         </w:tc>
         <w:tc>
           <w:tcPr>
-            <w:tcW w:type="dxa" w:w="2300"/>
+            <w:tcW w:type="dxa" w:w="2600"/>
             <w:tcMar>
               <w:top w:type="dxa" w:w="50"/>
               <w:left w:type="dxa" w:w="80"/>
@@ -5419,7 +5324,7 @@
       <w:tr>
         <w:tc>
           <w:tcPr>
-            <w:tcW w:type="dxa" w:w="3200"/>
+            <w:tcW w:type="dxa" w:w="4550"/>
             <w:tcMar>
               <w:top w:type="dxa" w:w="50"/>
               <w:left w:type="dxa" w:w="80"/>
@@ -5451,7 +5356,7 @@
         </w:tc>
         <w:tc>
           <w:tcPr>
-            <w:tcW w:type="dxa" w:w="2300"/>
+            <w:tcW w:type="dxa" w:w="2600"/>
             <w:tcMar>
               <w:top w:type="dxa" w:w="50"/>
               <w:left w:type="dxa" w:w="80"/>
@@ -5483,7 +5388,7 @@
         </w:tc>
         <w:tc>
           <w:tcPr>
-            <w:tcW w:type="dxa" w:w="2300"/>
+            <w:tcW w:type="dxa" w:w="2600"/>
             <w:tcMar>
               <w:top w:type="dxa" w:w="50"/>
               <w:left w:type="dxa" w:w="80"/>
@@ -5517,7 +5422,7 @@
       <w:tr>
         <w:tc>
           <w:tcPr>
-            <w:tcW w:type="dxa" w:w="3200"/>
+            <w:tcW w:type="dxa" w:w="4550"/>
             <w:tcMar>
               <w:top w:type="dxa" w:w="50"/>
               <w:left w:type="dxa" w:w="80"/>
@@ -5549,7 +5454,7 @@
         </w:tc>
         <w:tc>
           <w:tcPr>
-            <w:tcW w:type="dxa" w:w="2300"/>
+            <w:tcW w:type="dxa" w:w="2600"/>
             <w:tcMar>
               <w:top w:type="dxa" w:w="50"/>
               <w:left w:type="dxa" w:w="80"/>
@@ -5581,7 +5486,7 @@
         </w:tc>
         <w:tc>
           <w:tcPr>
-            <w:tcW w:type="dxa" w:w="2300"/>
+            <w:tcW w:type="dxa" w:w="2600"/>
             <w:tcMar>
               <w:top w:type="dxa" w:w="50"/>
               <w:left w:type="dxa" w:w="80"/>
@@ -5615,7 +5520,7 @@
       <w:tr>
         <w:tc>
           <w:tcPr>
-            <w:tcW w:type="dxa" w:w="3200"/>
+            <w:tcW w:type="dxa" w:w="4550"/>
             <w:tcMar>
               <w:top w:type="dxa" w:w="50"/>
               <w:left w:type="dxa" w:w="80"/>
@@ -5647,7 +5552,7 @@
         </w:tc>
         <w:tc>
           <w:tcPr>
-            <w:tcW w:type="dxa" w:w="2300"/>
+            <w:tcW w:type="dxa" w:w="2600"/>
             <w:tcMar>
               <w:top w:type="dxa" w:w="50"/>
               <w:left w:type="dxa" w:w="80"/>
@@ -5679,7 +5584,7 @@
         </w:tc>
         <w:tc>
           <w:tcPr>
-            <w:tcW w:type="dxa" w:w="2300"/>
+            <w:tcW w:type="dxa" w:w="2600"/>
             <w:tcMar>
               <w:top w:type="dxa" w:w="50"/>
               <w:left w:type="dxa" w:w="80"/>
@@ -5713,7 +5618,7 @@
       <w:tr>
         <w:tc>
           <w:tcPr>
-            <w:tcW w:type="dxa" w:w="3200"/>
+            <w:tcW w:type="dxa" w:w="4550"/>
             <w:tcMar>
               <w:top w:type="dxa" w:w="50"/>
               <w:left w:type="dxa" w:w="80"/>
@@ -5745,7 +5650,7 @@
         </w:tc>
         <w:tc>
           <w:tcPr>
-            <w:tcW w:type="dxa" w:w="2300"/>
+            <w:tcW w:type="dxa" w:w="2600"/>
             <w:tcMar>
               <w:top w:type="dxa" w:w="50"/>
               <w:left w:type="dxa" w:w="80"/>
@@ -5777,7 +5682,7 @@
         </w:tc>
         <w:tc>
           <w:tcPr>
-            <w:tcW w:type="dxa" w:w="2300"/>
+            <w:tcW w:type="dxa" w:w="2600"/>
             <w:tcMar>
               <w:top w:type="dxa" w:w="50"/>
               <w:left w:type="dxa" w:w="80"/>
@@ -5889,7 +5794,7 @@
           <w:sz w:val="18"/>
           <w:szCs w:val="18"/>
         </w:rPr>
-        <w:t xml:space="preserve">The existing transfer pricing documentation supports a median of 3% on the current shareholder loans. It does not govern the new facility, but the new study will need to explain any departure from it. Keytree’s credit position has deteriorated - negative equity, no turnover, no security - so a materially higher rate may be supportable; that is the study’s conclusion to reach and is not assumed in this paper. A local file is required in any event, the €20m facility being above the €10m financing threshold. The study should be commissioned before any expectation of the benefit is communicated.</w:t>
+        <w:t xml:space="preserve">The existing transfer pricing documentation supports a median of 3% on the current shareholder loans. It does not govern the new facility, but the new study will need to explain any departure from it. Keytree’s credit position has deteriorated - negative equity, no turnover, no security - so a materially higher rate may be supportable; that is the study’s conclusion to reach and is not assumed in this paper. A local file is required in any event, the €20m facility being above the €10m financing threshold. The study should be commissioned before any figure is put to the shareholders.</w:t>
       </w:r>
     </w:p>
     <w:p>
@@ -5914,7 +5819,7 @@
     </w:p>
     <w:tbl>
       <w:tblPr>
-        <w:tblW w:type="dxa" w:w="9576"/>
+        <w:tblW w:type="dxa" w:w="9750"/>
         <w:tblBorders>
           <w:top w:val="single" w:color="000000" w:sz="8"/>
           <w:left w:val="none"/>
@@ -5926,7 +5831,7 @@
       </w:tblPr>
       <w:tblGrid>
         <w:gridCol w:w="2350"/>
-        <w:gridCol w:w="7226"/>
+        <w:gridCol w:w="7400"/>
       </w:tblGrid>
       <w:tr>
         <w:tc>
@@ -5963,7 +5868,7 @@
         </w:tc>
         <w:tc>
           <w:tcPr>
-            <w:tcW w:type="dxa" w:w="7226"/>
+            <w:tcW w:type="dxa" w:w="7400"/>
             <w:tcMar>
               <w:top w:type="dxa" w:w="50"/>
               <w:left w:type="dxa" w:w="80"/>
@@ -6029,7 +5934,7 @@
         </w:tc>
         <w:tc>
           <w:tcPr>
-            <w:tcW w:type="dxa" w:w="7226"/>
+            <w:tcW w:type="dxa" w:w="7400"/>
             <w:tcMar>
               <w:top w:type="dxa" w:w="50"/>
               <w:left w:type="dxa" w:w="80"/>
@@ -6095,7 +6000,7 @@
         </w:tc>
         <w:tc>
           <w:tcPr>
-            <w:tcW w:type="dxa" w:w="7226"/>
+            <w:tcW w:type="dxa" w:w="7400"/>
             <w:tcMar>
               <w:top w:type="dxa" w:w="50"/>
               <w:left w:type="dxa" w:w="80"/>
@@ -6161,7 +6066,7 @@
         </w:tc>
         <w:tc>
           <w:tcPr>
-            <w:tcW w:type="dxa" w:w="7226"/>
+            <w:tcW w:type="dxa" w:w="7400"/>
             <w:tcMar>
               <w:top w:type="dxa" w:w="50"/>
               <w:left w:type="dxa" w:w="80"/>
@@ -6253,26 +6158,7 @@
           <w:sz w:val="15"/>
           <w:szCs w:val="15"/>
         </w:rPr>
-        <w:t xml:space="preserve">Review</w:t>
-      </w:r>
-    </w:p>
-    <w:p>
-      <w:pPr>
-        <w:spacing w:after="30"/>
-      </w:pPr>
-      <w:r>
-        <w:rPr>
-          <w:rFonts w:ascii="Arial" w:cs="Arial" w:eastAsia="Arial" w:hAnsi="Arial"/>
-          <w:b/>
-          <w:bCs/>
-          <w:i w:val="false"/>
-          <w:iCs w:val="false"/>
-          <w:caps w:val="false"/>
-          <w:color w:val="000000"/>
-          <w:sz w:val="27"/>
-          <w:szCs w:val="27"/>
-        </w:rPr>
-        <w:t xml:space="preserve">Matters expected to be raised on review</w:t>
+        <w:t xml:space="preserve">Structuring memorandum</w:t>
       </w:r>
     </w:p>
     <w:p>
@@ -6285,935 +6171,29 @@
       <w:r>
         <w:rPr>
           <w:rFonts w:ascii="Arial" w:cs="Arial" w:eastAsia="Arial" w:hAnsi="Arial"/>
-          <w:b w:val="false"/>
-          <w:bCs w:val="false"/>
-          <w:i/>
-          <w:iCs/>
-          <w:caps w:val="false"/>
-          <w:color w:val="595959"/>
-          <w:sz w:val="19"/>
-          <w:szCs w:val="19"/>
-        </w:rPr>
-        <w:t xml:space="preserve">Anticipated challenges to the recommendation and the positions taken in this paper</w:t>
-      </w:r>
-    </w:p>
-    <w:tbl>
-      <w:tblPr>
-        <w:tblW w:type="dxa" w:w="9576"/>
-        <w:tblBorders>
-          <w:top w:val="single" w:color="000000" w:sz="8"/>
-          <w:left w:val="none"/>
-          <w:bottom w:val="single" w:color="000000" w:sz="8"/>
-          <w:right w:val="none"/>
-          <w:insideH w:val="single" w:color="BFBFBF" w:sz="4"/>
-          <w:insideV w:val="none"/>
-        </w:tblBorders>
-      </w:tblPr>
-      <w:tblGrid>
-        <w:gridCol w:w="1500"/>
-        <w:gridCol w:w="3800"/>
-        <w:gridCol w:w="4276"/>
-      </w:tblGrid>
-      <w:tr>
-        <w:trPr>
-          <w:tblHeader/>
-        </w:trPr>
-        <w:tc>
-          <w:tcPr>
-            <w:tcW w:type="dxa" w:w="1500"/>
-            <w:shd w:fill="F2F2F2" w:val="clear"/>
-            <w:tcMar>
-              <w:top w:type="dxa" w:w="50"/>
-              <w:left w:type="dxa" w:w="80"/>
-              <w:bottom w:type="dxa" w:w="30"/>
-              <w:right w:type="dxa" w:w="80"/>
-            </w:tcMar>
-            <w:vAlign w:val="top"/>
-          </w:tcPr>
-          <w:p>
-            <w:pPr>
-              <w:spacing w:after="20" w:line="228" w:lineRule="auto"/>
-              <w:jc w:val="left"/>
-            </w:pPr>
-            <w:r>
-              <w:rPr>
-                <w:rFonts w:ascii="Arial" w:cs="Arial" w:eastAsia="Arial" w:hAnsi="Arial"/>
-                <w:b/>
-                <w:bCs/>
-                <w:i w:val="false"/>
-                <w:iCs w:val="false"/>
-                <w:caps w:val="false"/>
-                <w:color w:val="000000"/>
-                <w:sz w:val="16"/>
-                <w:szCs w:val="16"/>
-              </w:rPr>
-              <w:t xml:space="preserve">Raised by</w:t>
-            </w:r>
-          </w:p>
-        </w:tc>
-        <w:tc>
-          <w:tcPr>
-            <w:tcW w:type="dxa" w:w="3800"/>
-            <w:shd w:fill="F2F2F2" w:val="clear"/>
-            <w:tcMar>
-              <w:top w:type="dxa" w:w="50"/>
-              <w:left w:type="dxa" w:w="80"/>
-              <w:bottom w:type="dxa" w:w="30"/>
-              <w:right w:type="dxa" w:w="80"/>
-            </w:tcMar>
-            <w:vAlign w:val="top"/>
-          </w:tcPr>
-          <w:p>
-            <w:pPr>
-              <w:spacing w:after="20" w:line="228" w:lineRule="auto"/>
-              <w:jc w:val="left"/>
-            </w:pPr>
-            <w:r>
-              <w:rPr>
-                <w:rFonts w:ascii="Arial" w:cs="Arial" w:eastAsia="Arial" w:hAnsi="Arial"/>
-                <w:b/>
-                <w:bCs/>
-                <w:i w:val="false"/>
-                <w:iCs w:val="false"/>
-                <w:caps w:val="false"/>
-                <w:color w:val="000000"/>
-                <w:sz w:val="16"/>
-                <w:szCs w:val="16"/>
-              </w:rPr>
-              <w:t xml:space="preserve">Matter</w:t>
-            </w:r>
-          </w:p>
-        </w:tc>
-        <w:tc>
-          <w:tcPr>
-            <w:tcW w:type="dxa" w:w="4276"/>
-            <w:shd w:fill="F2F2F2" w:val="clear"/>
-            <w:tcMar>
-              <w:top w:type="dxa" w:w="50"/>
-              <w:left w:type="dxa" w:w="80"/>
-              <w:bottom w:type="dxa" w:w="30"/>
-              <w:right w:type="dxa" w:w="80"/>
-            </w:tcMar>
-            <w:vAlign w:val="top"/>
-          </w:tcPr>
-          <w:p>
-            <w:pPr>
-              <w:spacing w:after="20" w:line="228" w:lineRule="auto"/>
-              <w:jc w:val="left"/>
-            </w:pPr>
-            <w:r>
-              <w:rPr>
-                <w:rFonts w:ascii="Arial" w:cs="Arial" w:eastAsia="Arial" w:hAnsi="Arial"/>
-                <w:b/>
-                <w:bCs/>
-                <w:i w:val="false"/>
-                <w:iCs w:val="false"/>
-                <w:caps w:val="false"/>
-                <w:color w:val="000000"/>
-                <w:sz w:val="16"/>
-                <w:szCs w:val="16"/>
-              </w:rPr>
-              <w:t xml:space="preserve">Position</w:t>
-            </w:r>
-          </w:p>
-        </w:tc>
-      </w:tr>
-      <w:tr>
-        <w:tc>
-          <w:tcPr>
-            <w:tcW w:type="dxa" w:w="1500"/>
-            <w:tcMar>
-              <w:top w:type="dxa" w:w="50"/>
-              <w:left w:type="dxa" w:w="80"/>
-              <w:bottom w:type="dxa" w:w="30"/>
-              <w:right w:type="dxa" w:w="80"/>
-            </w:tcMar>
-            <w:vAlign w:val="top"/>
-          </w:tcPr>
-          <w:p>
-            <w:pPr>
-              <w:spacing w:after="20" w:line="228" w:lineRule="auto"/>
-              <w:jc w:val="left"/>
-            </w:pPr>
-            <w:r>
-              <w:rPr>
-                <w:rFonts w:ascii="Arial" w:cs="Arial" w:eastAsia="Arial" w:hAnsi="Arial"/>
-                <w:b w:val="false"/>
-                <w:bCs w:val="false"/>
-                <w:i w:val="false"/>
-                <w:iCs w:val="false"/>
-                <w:caps w:val="false"/>
-                <w:color w:val="000000"/>
-                <w:sz w:val="16"/>
-                <w:szCs w:val="16"/>
-              </w:rPr>
-              <w:t xml:space="preserve">Reviewing partner</w:t>
-            </w:r>
-          </w:p>
-        </w:tc>
-        <w:tc>
-          <w:tcPr>
-            <w:tcW w:type="dxa" w:w="3800"/>
-            <w:tcMar>
-              <w:top w:type="dxa" w:w="50"/>
-              <w:left w:type="dxa" w:w="80"/>
-              <w:bottom w:type="dxa" w:w="30"/>
-              <w:right w:type="dxa" w:w="80"/>
-            </w:tcMar>
-            <w:vAlign w:val="top"/>
-          </w:tcPr>
-          <w:p>
-            <w:pPr>
-              <w:spacing w:after="20" w:line="228" w:lineRule="auto"/>
-              <w:jc w:val="left"/>
-            </w:pPr>
-            <w:r>
-              <w:rPr>
-                <w:rFonts w:ascii="Arial" w:cs="Arial" w:eastAsia="Arial" w:hAnsi="Arial"/>
-                <w:b w:val="false"/>
-                <w:bCs w:val="false"/>
-                <w:i w:val="false"/>
-                <w:iCs w:val="false"/>
-                <w:caps w:val="false"/>
-                <w:color w:val="000000"/>
-                <w:sz w:val="16"/>
-                <w:szCs w:val="16"/>
-              </w:rPr>
-              <w:t xml:space="preserve">Whether the recommendation depends on the notional interest deduction remaining available in Keytree.</w:t>
-            </w:r>
-          </w:p>
-        </w:tc>
-        <w:tc>
-          <w:tcPr>
-            <w:tcW w:type="dxa" w:w="4276"/>
-            <w:tcMar>
-              <w:top w:type="dxa" w:w="50"/>
-              <w:left w:type="dxa" w:w="80"/>
-              <w:bottom w:type="dxa" w:w="30"/>
-              <w:right w:type="dxa" w:w="80"/>
-            </w:tcMar>
-            <w:vAlign w:val="top"/>
-          </w:tcPr>
-          <w:p>
-            <w:pPr>
-              <w:spacing w:after="20" w:line="228" w:lineRule="auto"/>
-              <w:jc w:val="left"/>
-            </w:pPr>
-            <w:r>
-              <w:rPr>
-                <w:rFonts w:ascii="Arial" w:cs="Arial" w:eastAsia="Arial" w:hAnsi="Arial"/>
-                <w:b w:val="false"/>
-                <w:bCs w:val="false"/>
-                <w:i w:val="false"/>
-                <w:iCs w:val="false"/>
-                <w:caps w:val="false"/>
-                <w:color w:val="000000"/>
-                <w:sz w:val="16"/>
-                <w:szCs w:val="16"/>
-              </w:rPr>
-              <w:t xml:space="preserve">It does not. The deduction in Keytree is quantified at nil and no part of the recommendation rests on it. The benefit arises at the finance company and through capitalisation of interest into the developments.</w:t>
-            </w:r>
-          </w:p>
-        </w:tc>
-      </w:tr>
-      <w:tr>
-        <w:tc>
-          <w:tcPr>
-            <w:tcW w:type="dxa" w:w="1500"/>
-            <w:tcMar>
-              <w:top w:type="dxa" w:w="50"/>
-              <w:left w:type="dxa" w:w="80"/>
-              <w:bottom w:type="dxa" w:w="30"/>
-              <w:right w:type="dxa" w:w="80"/>
-            </w:tcMar>
-            <w:vAlign w:val="top"/>
-          </w:tcPr>
-          <w:p>
-            <w:pPr>
-              <w:spacing w:after="20" w:line="228" w:lineRule="auto"/>
-              <w:jc w:val="left"/>
-            </w:pPr>
-            <w:r>
-              <w:rPr>
-                <w:rFonts w:ascii="Arial" w:cs="Arial" w:eastAsia="Arial" w:hAnsi="Arial"/>
-                <w:b w:val="false"/>
-                <w:bCs w:val="false"/>
-                <w:i w:val="false"/>
-                <w:iCs w:val="false"/>
-                <w:caps w:val="false"/>
-                <w:color w:val="000000"/>
-                <w:sz w:val="16"/>
-                <w:szCs w:val="16"/>
-              </w:rPr>
-              <w:t xml:space="preserve">Tax advisor</w:t>
-            </w:r>
-          </w:p>
-        </w:tc>
-        <w:tc>
-          <w:tcPr>
-            <w:tcW w:type="dxa" w:w="3800"/>
-            <w:tcMar>
-              <w:top w:type="dxa" w:w="50"/>
-              <w:left w:type="dxa" w:w="80"/>
-              <w:bottom w:type="dxa" w:w="30"/>
-              <w:right w:type="dxa" w:w="80"/>
-            </w:tcMar>
-            <w:vAlign w:val="top"/>
-          </w:tcPr>
-          <w:p>
-            <w:pPr>
-              <w:spacing w:after="20" w:line="228" w:lineRule="auto"/>
-              <w:jc w:val="left"/>
-            </w:pPr>
-            <w:r>
-              <w:rPr>
-                <w:rFonts w:ascii="Arial" w:cs="Arial" w:eastAsia="Arial" w:hAnsi="Arial"/>
-                <w:b w:val="false"/>
-                <w:bCs w:val="false"/>
-                <w:i w:val="false"/>
-                <w:iCs w:val="false"/>
-                <w:caps w:val="false"/>
-                <w:color w:val="000000"/>
-                <w:sz w:val="16"/>
-                <w:szCs w:val="16"/>
-              </w:rPr>
-              <w:t xml:space="preserve">The interaction of Article 9B with its anti-avoidance provisions and the general anti-avoidance rule, given common ownership.</w:t>
-            </w:r>
-          </w:p>
-        </w:tc>
-        <w:tc>
-          <w:tcPr>
-            <w:tcW w:type="dxa" w:w="4276"/>
-            <w:tcMar>
-              <w:top w:type="dxa" w:w="50"/>
-              <w:left w:type="dxa" w:w="80"/>
-              <w:bottom w:type="dxa" w:w="30"/>
-              <w:right w:type="dxa" w:w="80"/>
-            </w:tcMar>
-            <w:vAlign w:val="top"/>
-          </w:tcPr>
-          <w:p>
-            <w:pPr>
-              <w:spacing w:after="20" w:line="228" w:lineRule="auto"/>
-              <w:jc w:val="left"/>
-            </w:pPr>
-            <w:r>
-              <w:rPr>
-                <w:rFonts w:ascii="Arial" w:cs="Arial" w:eastAsia="Arial" w:hAnsi="Arial"/>
-                <w:b w:val="false"/>
-                <w:bCs w:val="false"/>
-                <w:i w:val="false"/>
-                <w:iCs w:val="false"/>
-                <w:caps w:val="false"/>
-                <w:color w:val="000000"/>
-                <w:sz w:val="16"/>
-                <w:szCs w:val="16"/>
-              </w:rPr>
-              <w:t xml:space="preserve">The equity in the finance company is new cash from Starter Point’s own resources, not a capitalisation of existing balances. If the deduction were nevertheless denied, tax at the finance company rises to 15% of the interest and the group position becomes broadly neutral rather than negative; the flexibility of the structure is unaffected.</w:t>
-            </w:r>
-          </w:p>
-        </w:tc>
-      </w:tr>
-      <w:tr>
-        <w:tc>
-          <w:tcPr>
-            <w:tcW w:type="dxa" w:w="1500"/>
-            <w:tcMar>
-              <w:top w:type="dxa" w:w="50"/>
-              <w:left w:type="dxa" w:w="80"/>
-              <w:bottom w:type="dxa" w:w="30"/>
-              <w:right w:type="dxa" w:w="80"/>
-            </w:tcMar>
-            <w:vAlign w:val="top"/>
-          </w:tcPr>
-          <w:p>
-            <w:pPr>
-              <w:spacing w:after="20" w:line="228" w:lineRule="auto"/>
-              <w:jc w:val="left"/>
-            </w:pPr>
-            <w:r>
-              <w:rPr>
-                <w:rFonts w:ascii="Arial" w:cs="Arial" w:eastAsia="Arial" w:hAnsi="Arial"/>
-                <w:b w:val="false"/>
-                <w:bCs w:val="false"/>
-                <w:i w:val="false"/>
-                <w:iCs w:val="false"/>
-                <w:caps w:val="false"/>
-                <w:color w:val="000000"/>
-                <w:sz w:val="16"/>
-                <w:szCs w:val="16"/>
-              </w:rPr>
-              <w:t xml:space="preserve">Tax officer</w:t>
-            </w:r>
-          </w:p>
-        </w:tc>
-        <w:tc>
-          <w:tcPr>
-            <w:tcW w:type="dxa" w:w="3800"/>
-            <w:tcMar>
-              <w:top w:type="dxa" w:w="50"/>
-              <w:left w:type="dxa" w:w="80"/>
-              <w:bottom w:type="dxa" w:w="30"/>
-              <w:right w:type="dxa" w:w="80"/>
-            </w:tcMar>
-            <w:vAlign w:val="top"/>
-          </w:tcPr>
-          <w:p>
-            <w:pPr>
-              <w:spacing w:after="20" w:line="228" w:lineRule="auto"/>
-              <w:jc w:val="left"/>
-            </w:pPr>
-            <w:r>
-              <w:rPr>
-                <w:rFonts w:ascii="Arial" w:cs="Arial" w:eastAsia="Arial" w:hAnsi="Arial"/>
-                <w:b w:val="false"/>
-                <w:bCs w:val="false"/>
-                <w:i w:val="false"/>
-                <w:iCs w:val="false"/>
-                <w:caps w:val="false"/>
-                <w:color w:val="000000"/>
-                <w:sz w:val="16"/>
-                <w:szCs w:val="16"/>
-              </w:rPr>
-              <w:t xml:space="preserve">A related-party loan replacing a shareholder loan, priced above the 3% median supported by the existing study, creating a deduction within a commonly owned group.</w:t>
-            </w:r>
-          </w:p>
-        </w:tc>
-        <w:tc>
-          <w:tcPr>
-            <w:tcW w:type="dxa" w:w="4276"/>
-            <w:tcMar>
-              <w:top w:type="dxa" w:w="50"/>
-              <w:left w:type="dxa" w:w="80"/>
-              <w:bottom w:type="dxa" w:w="30"/>
-              <w:right w:type="dxa" w:w="80"/>
-            </w:tcMar>
-            <w:vAlign w:val="top"/>
-          </w:tcPr>
-          <w:p>
-            <w:pPr>
-              <w:spacing w:after="20" w:line="228" w:lineRule="auto"/>
-              <w:jc w:val="left"/>
-            </w:pPr>
-            <w:r>
-              <w:rPr>
-                <w:rFonts w:ascii="Arial" w:cs="Arial" w:eastAsia="Arial" w:hAnsi="Arial"/>
-                <w:b w:val="false"/>
-                <w:bCs w:val="false"/>
-                <w:i w:val="false"/>
-                <w:iCs w:val="false"/>
-                <w:caps w:val="false"/>
-                <w:color w:val="000000"/>
-                <w:sz w:val="16"/>
-                <w:szCs w:val="16"/>
-              </w:rPr>
-              <w:t xml:space="preserve">The rate will be the conclusion of a new transfer pricing study on current facts and is not assumed. The local file will be in place before the first interest accrual. The advance is received before any repayment to Mr Levy, the commercial rationale is minuted, and the arrangements are disclosed and documented.</w:t>
-            </w:r>
-          </w:p>
-        </w:tc>
-      </w:tr>
-      <w:tr>
-        <w:tc>
-          <w:tcPr>
-            <w:tcW w:type="dxa" w:w="1500"/>
-            <w:tcMar>
-              <w:top w:type="dxa" w:w="50"/>
-              <w:left w:type="dxa" w:w="80"/>
-              <w:bottom w:type="dxa" w:w="30"/>
-              <w:right w:type="dxa" w:w="80"/>
-            </w:tcMar>
-            <w:vAlign w:val="top"/>
-          </w:tcPr>
-          <w:p>
-            <w:pPr>
-              <w:spacing w:after="20" w:line="228" w:lineRule="auto"/>
-              <w:jc w:val="left"/>
-            </w:pPr>
-            <w:r>
-              <w:rPr>
-                <w:rFonts w:ascii="Arial" w:cs="Arial" w:eastAsia="Arial" w:hAnsi="Arial"/>
-                <w:b w:val="false"/>
-                <w:bCs w:val="false"/>
-                <w:i w:val="false"/>
-                <w:iCs w:val="false"/>
-                <w:caps w:val="false"/>
-                <w:color w:val="000000"/>
-                <w:sz w:val="16"/>
-                <w:szCs w:val="16"/>
-              </w:rPr>
-              <w:t xml:space="preserve">Ultimate beneficial owner</w:t>
-            </w:r>
-          </w:p>
-        </w:tc>
-        <w:tc>
-          <w:tcPr>
-            <w:tcW w:type="dxa" w:w="3800"/>
-            <w:tcMar>
-              <w:top w:type="dxa" w:w="50"/>
-              <w:left w:type="dxa" w:w="80"/>
-              <w:bottom w:type="dxa" w:w="30"/>
-              <w:right w:type="dxa" w:w="80"/>
-            </w:tcMar>
-            <w:vAlign w:val="top"/>
-          </w:tcPr>
-          <w:p>
-            <w:pPr>
-              <w:spacing w:after="20" w:line="228" w:lineRule="auto"/>
-              <w:jc w:val="left"/>
-            </w:pPr>
-            <w:r>
-              <w:rPr>
-                <w:rFonts w:ascii="Arial" w:cs="Arial" w:eastAsia="Arial" w:hAnsi="Arial"/>
-                <w:b w:val="false"/>
-                <w:bCs w:val="false"/>
-                <w:i w:val="false"/>
-                <w:iCs w:val="false"/>
-                <w:caps w:val="false"/>
-                <w:color w:val="000000"/>
-                <w:sz w:val="16"/>
-                <w:szCs w:val="16"/>
-              </w:rPr>
-              <w:t xml:space="preserve">Why tax should be borne at the finance company when an equity subscription bears none.</w:t>
-            </w:r>
-          </w:p>
-        </w:tc>
-        <w:tc>
-          <w:tcPr>
-            <w:tcW w:type="dxa" w:w="4276"/>
-            <w:tcMar>
-              <w:top w:type="dxa" w:w="50"/>
-              <w:left w:type="dxa" w:w="80"/>
-              <w:bottom w:type="dxa" w:w="30"/>
-              <w:right w:type="dxa" w:w="80"/>
-            </w:tcMar>
-            <w:vAlign w:val="top"/>
-          </w:tcPr>
-          <w:p>
-            <w:pPr>
-              <w:spacing w:after="20" w:line="228" w:lineRule="auto"/>
-              <w:jc w:val="left"/>
-            </w:pPr>
-            <w:r>
-              <w:rPr>
-                <w:rFonts w:ascii="Arial" w:cs="Arial" w:eastAsia="Arial" w:hAnsi="Arial"/>
-                <w:b w:val="false"/>
-                <w:bCs w:val="false"/>
-                <w:i w:val="false"/>
-                <w:iCs w:val="false"/>
-                <w:caps w:val="false"/>
-                <w:color w:val="000000"/>
-                <w:sz w:val="16"/>
-                <w:szCs w:val="16"/>
-              </w:rPr>
-              <w:t xml:space="preserve">An equity subscription produces no deduction of any value on these facts. The 3% effective cost at the finance company is the condition of 15% relief in Keytree on delivery; the group retains approximately 12% of each euro of interest. An equity route forgoes the entire benefit.</w:t>
-            </w:r>
-          </w:p>
-        </w:tc>
-      </w:tr>
-      <w:tr>
-        <w:tc>
-          <w:tcPr>
-            <w:tcW w:type="dxa" w:w="1500"/>
-            <w:tcMar>
-              <w:top w:type="dxa" w:w="50"/>
-              <w:left w:type="dxa" w:w="80"/>
-              <w:bottom w:type="dxa" w:w="30"/>
-              <w:right w:type="dxa" w:w="80"/>
-            </w:tcMar>
-            <w:vAlign w:val="top"/>
-          </w:tcPr>
-          <w:p>
-            <w:pPr>
-              <w:spacing w:after="20" w:line="228" w:lineRule="auto"/>
-              <w:jc w:val="left"/>
-            </w:pPr>
-            <w:r>
-              <w:rPr>
-                <w:rFonts w:ascii="Arial" w:cs="Arial" w:eastAsia="Arial" w:hAnsi="Arial"/>
-                <w:b w:val="false"/>
-                <w:bCs w:val="false"/>
-                <w:i w:val="false"/>
-                <w:iCs w:val="false"/>
-                <w:caps w:val="false"/>
-                <w:color w:val="000000"/>
-                <w:sz w:val="16"/>
-                <w:szCs w:val="16"/>
-              </w:rPr>
-              <w:t xml:space="preserve">Ultimate beneficial owner</w:t>
-            </w:r>
-          </w:p>
-        </w:tc>
-        <w:tc>
-          <w:tcPr>
-            <w:tcW w:type="dxa" w:w="3800"/>
-            <w:tcMar>
-              <w:top w:type="dxa" w:w="50"/>
-              <w:left w:type="dxa" w:w="80"/>
-              <w:bottom w:type="dxa" w:w="30"/>
-              <w:right w:type="dxa" w:w="80"/>
-            </w:tcMar>
-            <w:vAlign w:val="top"/>
-          </w:tcPr>
-          <w:p>
-            <w:pPr>
-              <w:spacing w:after="20" w:line="228" w:lineRule="auto"/>
-              <w:jc w:val="left"/>
-            </w:pPr>
-            <w:r>
-              <w:rPr>
-                <w:rFonts w:ascii="Arial" w:cs="Arial" w:eastAsia="Arial" w:hAnsi="Arial"/>
-                <w:b w:val="false"/>
-                <w:bCs w:val="false"/>
-                <w:i w:val="false"/>
-                <w:iCs w:val="false"/>
-                <w:caps w:val="false"/>
-                <w:color w:val="000000"/>
-                <w:sz w:val="16"/>
-                <w:szCs w:val="16"/>
-              </w:rPr>
-              <w:t xml:space="preserve">The transfer of approximately €1,6m of value to the minority holders under structure 1A.</w:t>
-            </w:r>
-          </w:p>
-        </w:tc>
-        <w:tc>
-          <w:tcPr>
-            <w:tcW w:type="dxa" w:w="4276"/>
-            <w:tcMar>
-              <w:top w:type="dxa" w:w="50"/>
-              <w:left w:type="dxa" w:w="80"/>
-              <w:bottom w:type="dxa" w:w="30"/>
-              <w:right w:type="dxa" w:w="80"/>
-            </w:tcMar>
-            <w:vAlign w:val="top"/>
-          </w:tcPr>
-          <w:p>
-            <w:pPr>
-              <w:spacing w:after="20" w:line="228" w:lineRule="auto"/>
-              <w:jc w:val="left"/>
-            </w:pPr>
-            <w:r>
-              <w:rPr>
-                <w:rFonts w:ascii="Arial" w:cs="Arial" w:eastAsia="Arial" w:hAnsi="Arial"/>
-                <w:b w:val="false"/>
-                <w:bCs w:val="false"/>
-                <w:i w:val="false"/>
-                <w:iCs w:val="false"/>
-                <w:caps w:val="false"/>
-                <w:color w:val="000000"/>
-                <w:sz w:val="16"/>
-                <w:szCs w:val="16"/>
-              </w:rPr>
-              <w:t xml:space="preserve">A direct consequence of requiring 80/10/5/5 on the register while equity is injected into a company with no reserves: only bonus shares funded from the subscription premium hold the minorities at 5%. Structure 3 involves no share issue and no transfer of value.</w:t>
-            </w:r>
-          </w:p>
-        </w:tc>
-      </w:tr>
-      <w:tr>
-        <w:tc>
-          <w:tcPr>
-            <w:tcW w:type="dxa" w:w="1500"/>
-            <w:tcMar>
-              <w:top w:type="dxa" w:w="50"/>
-              <w:left w:type="dxa" w:w="80"/>
-              <w:bottom w:type="dxa" w:w="30"/>
-              <w:right w:type="dxa" w:w="80"/>
-            </w:tcMar>
-            <w:vAlign w:val="top"/>
-          </w:tcPr>
-          <w:p>
-            <w:pPr>
-              <w:spacing w:after="20" w:line="228" w:lineRule="auto"/>
-              <w:jc w:val="left"/>
-            </w:pPr>
-            <w:r>
-              <w:rPr>
-                <w:rFonts w:ascii="Arial" w:cs="Arial" w:eastAsia="Arial" w:hAnsi="Arial"/>
-                <w:b w:val="false"/>
-                <w:bCs w:val="false"/>
-                <w:i w:val="false"/>
-                <w:iCs w:val="false"/>
-                <w:caps w:val="false"/>
-                <w:color w:val="000000"/>
-                <w:sz w:val="16"/>
-                <w:szCs w:val="16"/>
-              </w:rPr>
-              <w:t xml:space="preserve">Minority advisors</w:t>
-            </w:r>
-          </w:p>
-        </w:tc>
-        <w:tc>
-          <w:tcPr>
-            <w:tcW w:type="dxa" w:w="3800"/>
-            <w:tcMar>
-              <w:top w:type="dxa" w:w="50"/>
-              <w:left w:type="dxa" w:w="80"/>
-              <w:bottom w:type="dxa" w:w="30"/>
-              <w:right w:type="dxa" w:w="80"/>
-            </w:tcMar>
-            <w:vAlign w:val="top"/>
-          </w:tcPr>
-          <w:p>
-            <w:pPr>
-              <w:spacing w:after="20" w:line="228" w:lineRule="auto"/>
-              <w:jc w:val="left"/>
-            </w:pPr>
-            <w:r>
-              <w:rPr>
-                <w:rFonts w:ascii="Arial" w:cs="Arial" w:eastAsia="Arial" w:hAnsi="Arial"/>
-                <w:b w:val="false"/>
-                <w:bCs w:val="false"/>
-                <w:i w:val="false"/>
-                <w:iCs w:val="false"/>
-                <w:caps w:val="false"/>
-                <w:color w:val="000000"/>
-                <w:sz w:val="16"/>
-                <w:szCs w:val="16"/>
-              </w:rPr>
-              <w:t xml:space="preserve">The treatment of pre-emption rights under Regulation 6 and the protection of the 5% entitlement.</w:t>
-            </w:r>
-          </w:p>
-        </w:tc>
-        <w:tc>
-          <w:tcPr>
-            <w:tcW w:type="dxa" w:w="4276"/>
-            <w:tcMar>
-              <w:top w:type="dxa" w:w="50"/>
-              <w:left w:type="dxa" w:w="80"/>
-              <w:bottom w:type="dxa" w:w="30"/>
-              <w:right w:type="dxa" w:w="80"/>
-            </w:tcMar>
-            <w:vAlign w:val="top"/>
-          </w:tcPr>
-          <w:p>
-            <w:pPr>
-              <w:spacing w:after="20" w:line="228" w:lineRule="auto"/>
-              <w:jc w:val="left"/>
-            </w:pPr>
-            <w:r>
-              <w:rPr>
-                <w:rFonts w:ascii="Arial" w:cs="Arial" w:eastAsia="Arial" w:hAnsi="Arial"/>
-                <w:b w:val="false"/>
-                <w:bCs w:val="false"/>
-                <w:i w:val="false"/>
-                <w:iCs w:val="false"/>
-                <w:caps w:val="false"/>
-                <w:color w:val="000000"/>
-                <w:sz w:val="16"/>
-                <w:szCs w:val="16"/>
-              </w:rPr>
-              <w:t xml:space="preserve">Under structure 3 no shares are issued and the minority position is unchanged. Under any share issue, waivers or a disapplying resolution are required, and the 5% entitlement is protected by bonus shares (1A) or by class rights in the Articles (1B), not by a side agreement.</w:t>
-            </w:r>
-          </w:p>
-        </w:tc>
-      </w:tr>
-      <w:tr>
-        <w:tc>
-          <w:tcPr>
-            <w:tcW w:type="dxa" w:w="1500"/>
-            <w:tcMar>
-              <w:top w:type="dxa" w:w="50"/>
-              <w:left w:type="dxa" w:w="80"/>
-              <w:bottom w:type="dxa" w:w="30"/>
-              <w:right w:type="dxa" w:w="80"/>
-            </w:tcMar>
-            <w:vAlign w:val="top"/>
-          </w:tcPr>
-          <w:p>
-            <w:pPr>
-              <w:spacing w:after="20" w:line="228" w:lineRule="auto"/>
-              <w:jc w:val="left"/>
-            </w:pPr>
-            <w:r>
-              <w:rPr>
-                <w:rFonts w:ascii="Arial" w:cs="Arial" w:eastAsia="Arial" w:hAnsi="Arial"/>
-                <w:b w:val="false"/>
-                <w:bCs w:val="false"/>
-                <w:i w:val="false"/>
-                <w:iCs w:val="false"/>
-                <w:caps w:val="false"/>
-                <w:color w:val="000000"/>
-                <w:sz w:val="16"/>
-                <w:szCs w:val="16"/>
-              </w:rPr>
-              <w:t xml:space="preserve">Auditors</w:t>
-            </w:r>
-          </w:p>
-        </w:tc>
-        <w:tc>
-          <w:tcPr>
-            <w:tcW w:type="dxa" w:w="3800"/>
-            <w:tcMar>
-              <w:top w:type="dxa" w:w="50"/>
-              <w:left w:type="dxa" w:w="80"/>
-              <w:bottom w:type="dxa" w:w="30"/>
-              <w:right w:type="dxa" w:w="80"/>
-            </w:tcMar>
-            <w:vAlign w:val="top"/>
-          </w:tcPr>
-          <w:p>
-            <w:pPr>
-              <w:spacing w:after="20" w:line="228" w:lineRule="auto"/>
-              <w:jc w:val="left"/>
-            </w:pPr>
-            <w:r>
-              <w:rPr>
-                <w:rFonts w:ascii="Arial" w:cs="Arial" w:eastAsia="Arial" w:hAnsi="Arial"/>
-                <w:b w:val="false"/>
-                <w:bCs w:val="false"/>
-                <w:i w:val="false"/>
-                <w:iCs w:val="false"/>
-                <w:caps w:val="false"/>
-                <w:color w:val="000000"/>
-                <w:sz w:val="16"/>
-                <w:szCs w:val="16"/>
-              </w:rPr>
-              <w:t xml:space="preserve">Going concern remains unresolved and gearing increases; whether the interest is properly capitalisable.</w:t>
-            </w:r>
-          </w:p>
-        </w:tc>
-        <w:tc>
-          <w:tcPr>
-            <w:tcW w:type="dxa" w:w="4276"/>
-            <w:tcMar>
-              <w:top w:type="dxa" w:w="50"/>
-              <w:left w:type="dxa" w:w="80"/>
-              <w:bottom w:type="dxa" w:w="30"/>
-              <w:right w:type="dxa" w:w="80"/>
-            </w:tcMar>
-            <w:vAlign w:val="top"/>
-          </w:tcPr>
-          <w:p>
-            <w:pPr>
-              <w:spacing w:after="20" w:line="228" w:lineRule="auto"/>
-              <w:jc w:val="left"/>
-            </w:pPr>
-            <w:r>
-              <w:rPr>
-                <w:rFonts w:ascii="Arial" w:cs="Arial" w:eastAsia="Arial" w:hAnsi="Arial"/>
-                <w:b w:val="false"/>
-                <w:bCs w:val="false"/>
-                <w:i w:val="false"/>
-                <w:iCs w:val="false"/>
-                <w:caps w:val="false"/>
-                <w:color w:val="000000"/>
-                <w:sz w:val="16"/>
-                <w:szCs w:val="16"/>
-              </w:rPr>
-              <w:t xml:space="preserve">The letter of support from Mr Levy continues, as at present. Borrowing costs directly attributable to the development of qualifying stock are capitalisable under the ordinary treatment for a developer recognising revenue on delivery; the 2025 inconsistency is to be corrected and the policy agreed before implementation. Where the audit position is the governing consideration, structure 1A is identified on page 1 as the appropriate choice.</w:t>
-            </w:r>
-          </w:p>
-        </w:tc>
-      </w:tr>
-      <w:tr>
-        <w:tc>
-          <w:tcPr>
-            <w:tcW w:type="dxa" w:w="1500"/>
-            <w:tcMar>
-              <w:top w:type="dxa" w:w="50"/>
-              <w:left w:type="dxa" w:w="80"/>
-              <w:bottom w:type="dxa" w:w="30"/>
-              <w:right w:type="dxa" w:w="80"/>
-            </w:tcMar>
-            <w:vAlign w:val="top"/>
-          </w:tcPr>
-          <w:p>
-            <w:pPr>
-              <w:spacing w:after="20" w:line="228" w:lineRule="auto"/>
-              <w:jc w:val="left"/>
-            </w:pPr>
-            <w:r>
-              <w:rPr>
-                <w:rFonts w:ascii="Arial" w:cs="Arial" w:eastAsia="Arial" w:hAnsi="Arial"/>
-                <w:b w:val="false"/>
-                <w:bCs w:val="false"/>
-                <w:i w:val="false"/>
-                <w:iCs w:val="false"/>
-                <w:caps w:val="false"/>
-                <w:color w:val="000000"/>
-                <w:sz w:val="16"/>
-                <w:szCs w:val="16"/>
-              </w:rPr>
-              <w:t xml:space="preserve">Receiving bank</w:t>
-            </w:r>
-          </w:p>
-        </w:tc>
-        <w:tc>
-          <w:tcPr>
-            <w:tcW w:type="dxa" w:w="3800"/>
-            <w:tcMar>
-              <w:top w:type="dxa" w:w="50"/>
-              <w:left w:type="dxa" w:w="80"/>
-              <w:bottom w:type="dxa" w:w="30"/>
-              <w:right w:type="dxa" w:w="80"/>
-            </w:tcMar>
-            <w:vAlign w:val="top"/>
-          </w:tcPr>
-          <w:p>
-            <w:pPr>
-              <w:spacing w:after="20" w:line="228" w:lineRule="auto"/>
-              <w:jc w:val="left"/>
-            </w:pPr>
-            <w:r>
-              <w:rPr>
-                <w:rFonts w:ascii="Arial" w:cs="Arial" w:eastAsia="Arial" w:hAnsi="Arial"/>
-                <w:b w:val="false"/>
-                <w:bCs w:val="false"/>
-                <w:i w:val="false"/>
-                <w:iCs w:val="false"/>
-                <w:caps w:val="false"/>
-                <w:color w:val="000000"/>
-                <w:sz w:val="16"/>
-                <w:szCs w:val="16"/>
-              </w:rPr>
-              <w:t xml:space="preserve">A €20m remittance from Nigeria into a Cyprus developer under common ownership.</w:t>
-            </w:r>
-          </w:p>
-        </w:tc>
-        <w:tc>
-          <w:tcPr>
-            <w:tcW w:type="dxa" w:w="4276"/>
-            <w:tcMar>
-              <w:top w:type="dxa" w:w="50"/>
-              <w:left w:type="dxa" w:w="80"/>
-              <w:bottom w:type="dxa" w:w="30"/>
-              <w:right w:type="dxa" w:w="80"/>
-            </w:tcMar>
-            <w:vAlign w:val="top"/>
-          </w:tcPr>
-          <w:p>
-            <w:pPr>
-              <w:spacing w:after="20" w:line="228" w:lineRule="auto"/>
-              <w:jc w:val="left"/>
-            </w:pPr>
-            <w:r>
-              <w:rPr>
-                <w:rFonts w:ascii="Arial" w:cs="Arial" w:eastAsia="Arial" w:hAnsi="Arial"/>
-                <w:b w:val="false"/>
-                <w:bCs w:val="false"/>
-                <w:i w:val="false"/>
-                <w:iCs w:val="false"/>
-                <w:caps w:val="false"/>
-                <w:color w:val="000000"/>
-                <w:sz w:val="16"/>
-                <w:szCs w:val="16"/>
-              </w:rPr>
-              <w:t xml:space="preserve">Source-of-funds evidence is to be assembled before the remittance and the Nigerian exchange control position confirmed at the sending end. The banking route is to be agreed as viable before a structure is implemented; where the bank prefers a Cyprus point of entry, the finance company itself provides it.</w:t>
-            </w:r>
-          </w:p>
-        </w:tc>
-      </w:tr>
-    </w:tbl>
+          <w:b/>
+          <w:bCs/>
+          <w:i w:val="false"/>
+          <w:iCs w:val="false"/>
+          <w:caps w:val="false"/>
+          <w:color w:val="000000"/>
+          <w:sz w:val="27"/>
+          <w:szCs w:val="27"/>
+        </w:rPr>
+        <w:t xml:space="preserve">Robustness of the recommendation</w:t>
+      </w:r>
+    </w:p>
     <w:p>
       <w:pPr>
         <w:keepLines/>
-        <w:spacing w:after="40" w:before="0" w:line="248" w:lineRule="auto"/>
+        <w:spacing w:after="110" w:line="248" w:lineRule="auto"/>
         <w:jc w:val="both"/>
       </w:pPr>
       <w:r>
         <w:rPr>
           <w:rFonts w:ascii="Arial" w:cs="Arial" w:eastAsia="Arial" w:hAnsi="Arial"/>
-          <w:b w:val="false"/>
-          <w:bCs w:val="false"/>
+          <w:b/>
+          <w:bCs/>
           <w:i w:val="false"/>
           <w:iCs w:val="false"/>
           <w:caps w:val="false"/>
@@ -7221,7 +6201,231 @@
           <w:sz w:val="18"/>
           <w:szCs w:val="18"/>
         </w:rPr>
-        <w:t xml:space="preserve"> </w:t>
+        <w:t xml:space="preserve">Reliance on the notional interest deduction.  </w:t>
+      </w:r>
+      <w:r>
+        <w:rPr>
+          <w:rFonts w:ascii="Arial" w:cs="Arial" w:eastAsia="Arial" w:hAnsi="Arial"/>
+          <w:b w:val="false"/>
+          <w:bCs w:val="false"/>
+          <w:i w:val="false"/>
+          <w:iCs w:val="false"/>
+          <w:caps w:val="false"/>
+          <w:color w:val="000000"/>
+          <w:sz w:val="18"/>
+          <w:szCs w:val="18"/>
+        </w:rPr>
+        <w:t xml:space="preserve">The recommendation does not depend on the deduction surviving in Keytree. That deduction is quantified at nil under every structure and has been disregarded. The benefit of structure 3 arises at the finance company, where the deduction shelters taxable interest, and in Keytree, where the interest is capitalised into development cost and relieved on delivery. Each element rests on settled law applied to the facts as they stand, not on a favourable reading of a contested provision.</w:t>
+      </w:r>
+    </w:p>
+    <w:p>
+      <w:pPr>
+        <w:keepLines/>
+        <w:spacing w:after="110" w:line="248" w:lineRule="auto"/>
+        <w:jc w:val="both"/>
+      </w:pPr>
+      <w:r>
+        <w:rPr>
+          <w:rFonts w:ascii="Arial" w:cs="Arial" w:eastAsia="Arial" w:hAnsi="Arial"/>
+          <w:b/>
+          <w:bCs/>
+          <w:i w:val="false"/>
+          <w:iCs w:val="false"/>
+          <w:caps w:val="false"/>
+          <w:color w:val="000000"/>
+          <w:sz w:val="18"/>
+          <w:szCs w:val="18"/>
+        </w:rPr>
+        <w:t xml:space="preserve">Anti-avoidance.  </w:t>
+      </w:r>
+      <w:r>
+        <w:rPr>
+          <w:rFonts w:ascii="Arial" w:cs="Arial" w:eastAsia="Arial" w:hAnsi="Arial"/>
+          <w:b w:val="false"/>
+          <w:bCs w:val="false"/>
+          <w:i w:val="false"/>
+          <w:iCs w:val="false"/>
+          <w:caps w:val="false"/>
+          <w:color w:val="000000"/>
+          <w:sz w:val="18"/>
+          <w:szCs w:val="18"/>
+        </w:rPr>
+        <w:t xml:space="preserve">The arrangements involve common ownership, and part of the funds will be applied in repaying Mr Levy’s loan. Article 9B carries a specific anti-abuse provision and the general anti-avoidance rule has been extended. The position is defensible: the equity in the finance company is new cash from Starter Point’s own resources rather than a capitalisation of existing balances, the lending is priced at arm’s length and documented, and the commercial purpose - a single funding vehicle from which the funds can be recovered and redeployed at any time - is genuine and will be minuted. Should the deduction nevertheless be denied, the cost is contained: tax at the finance company rises to 15% of the interest, broadly matched by the relief in Keytree on delivery, leaving the group position neutral rather than adverse.</w:t>
+      </w:r>
+    </w:p>
+    <w:p>
+      <w:pPr>
+        <w:keepLines/>
+        <w:spacing w:after="110" w:line="248" w:lineRule="auto"/>
+        <w:jc w:val="both"/>
+      </w:pPr>
+      <w:r>
+        <w:rPr>
+          <w:rFonts w:ascii="Arial" w:cs="Arial" w:eastAsia="Arial" w:hAnsi="Arial"/>
+          <w:b/>
+          <w:bCs/>
+          <w:i w:val="false"/>
+          <w:iCs w:val="false"/>
+          <w:caps w:val="false"/>
+          <w:color w:val="000000"/>
+          <w:sz w:val="18"/>
+          <w:szCs w:val="18"/>
+        </w:rPr>
+        <w:t xml:space="preserve">The interest rate.  </w:t>
+      </w:r>
+      <w:r>
+        <w:rPr>
+          <w:rFonts w:ascii="Arial" w:cs="Arial" w:eastAsia="Arial" w:hAnsi="Arial"/>
+          <w:b w:val="false"/>
+          <w:bCs w:val="false"/>
+          <w:i w:val="false"/>
+          <w:iCs w:val="false"/>
+          <w:caps w:val="false"/>
+          <w:color w:val="000000"/>
+          <w:sz w:val="18"/>
+          <w:szCs w:val="18"/>
+        </w:rPr>
+        <w:t xml:space="preserve">The existing transfer pricing documentation supports a median of 3% on the current shareholder loans, and any departure from it will need to be explained. Keytree’s credit position has deteriorated since those loans were priced - negative equity, no turnover, no security - which points towards a higher rate, but no rate is assumed in this paper: the new study will conclude on it, and the local file will be in place before the first interest accrual. A rate the study cannot support will not be used.</w:t>
+      </w:r>
+    </w:p>
+    <w:p>
+      <w:pPr>
+        <w:keepLines/>
+        <w:spacing w:after="110" w:line="248" w:lineRule="auto"/>
+        <w:jc w:val="both"/>
+      </w:pPr>
+      <w:r>
+        <w:rPr>
+          <w:rFonts w:ascii="Arial" w:cs="Arial" w:eastAsia="Arial" w:hAnsi="Arial"/>
+          <w:b/>
+          <w:bCs/>
+          <w:i w:val="false"/>
+          <w:iCs w:val="false"/>
+          <w:caps w:val="false"/>
+          <w:color w:val="000000"/>
+          <w:sz w:val="18"/>
+          <w:szCs w:val="18"/>
+        </w:rPr>
+        <w:t xml:space="preserve">The cost of the structure against an equity subscription.  </w:t>
+      </w:r>
+      <w:r>
+        <w:rPr>
+          <w:rFonts w:ascii="Arial" w:cs="Arial" w:eastAsia="Arial" w:hAnsi="Arial"/>
+          <w:b w:val="false"/>
+          <w:bCs w:val="false"/>
+          <w:i w:val="false"/>
+          <w:iCs w:val="false"/>
+          <w:caps w:val="false"/>
+          <w:color w:val="000000"/>
+          <w:sz w:val="18"/>
+          <w:szCs w:val="18"/>
+        </w:rPr>
+        <w:t xml:space="preserve">An equity subscription bears no tax, but it also secures no relief: the deduction it generates in Keytree is worth nothing, in the year of sale as in every other year. The 3% effective charge at the finance company is the price of bringing a deductible cost into the developments and relieving it at 15% on delivery. The group retains approximately 12 cents of each euro of interest; under the equity routes it retains nothing.</w:t>
+      </w:r>
+    </w:p>
+    <w:p>
+      <w:pPr>
+        <w:keepLines/>
+        <w:spacing w:after="110" w:line="248" w:lineRule="auto"/>
+        <w:jc w:val="both"/>
+      </w:pPr>
+      <w:r>
+        <w:rPr>
+          <w:rFonts w:ascii="Arial" w:cs="Arial" w:eastAsia="Arial" w:hAnsi="Arial"/>
+          <w:b/>
+          <w:bCs/>
+          <w:i w:val="false"/>
+          <w:iCs w:val="false"/>
+          <w:caps w:val="false"/>
+          <w:color w:val="000000"/>
+          <w:sz w:val="18"/>
+          <w:szCs w:val="18"/>
+        </w:rPr>
+        <w:t xml:space="preserve">The minority holders.  </w:t>
+      </w:r>
+      <w:r>
+        <w:rPr>
+          <w:rFonts w:ascii="Arial" w:cs="Arial" w:eastAsia="Arial" w:hAnsi="Arial"/>
+          <w:b w:val="false"/>
+          <w:bCs w:val="false"/>
+          <w:i w:val="false"/>
+          <w:iCs w:val="false"/>
+          <w:caps w:val="false"/>
+          <w:color w:val="000000"/>
+          <w:sz w:val="18"/>
+          <w:szCs w:val="18"/>
+        </w:rPr>
+        <w:t xml:space="preserve">Under structure 3 no shares are issued, pre-emption under Regulation 6 is not engaged and the register is untouched. If an equity route is preferred, the minorities’ 5% is held by bonus shares (structure 1A) or by class rights written into the Articles (structure 1B); in neither case does their protection depend on a side agreement. The €1,6m of value passing to them under 1A is the arithmetic cost of the 80/10/5/5 requirement, and should either be accepted or the requirement revisited before that route is chosen.</w:t>
+      </w:r>
+    </w:p>
+    <w:p>
+      <w:pPr>
+        <w:keepLines/>
+        <w:spacing w:after="110" w:line="248" w:lineRule="auto"/>
+        <w:jc w:val="both"/>
+      </w:pPr>
+      <w:r>
+        <w:rPr>
+          <w:rFonts w:ascii="Arial" w:cs="Arial" w:eastAsia="Arial" w:hAnsi="Arial"/>
+          <w:b/>
+          <w:bCs/>
+          <w:i w:val="false"/>
+          <w:iCs w:val="false"/>
+          <w:caps w:val="false"/>
+          <w:color w:val="000000"/>
+          <w:sz w:val="18"/>
+          <w:szCs w:val="18"/>
+        </w:rPr>
+        <w:t xml:space="preserve">The audit position.  </w:t>
+      </w:r>
+      <w:r>
+        <w:rPr>
+          <w:rFonts w:ascii="Arial" w:cs="Arial" w:eastAsia="Arial" w:hAnsi="Arial"/>
+          <w:b w:val="false"/>
+          <w:bCs w:val="false"/>
+          <w:i w:val="false"/>
+          <w:iCs w:val="false"/>
+          <w:caps w:val="false"/>
+          <w:color w:val="000000"/>
+          <w:sz w:val="18"/>
+          <w:szCs w:val="18"/>
+        </w:rPr>
+        <w:t xml:space="preserve">Structure 3 leaves the going concern position where it stands today: negative equity, supported by Mr Levy’s letter, with the related disclosure continuing. Capitalisation of borrowing costs is the ordinary treatment for a developer recognising revenue on delivery; the inconsistency in the 2025 draft accounts is to be corrected and the policy agreed with the auditors before implementation, since the benefit of the structure depends on it. If the audit position is the decisive consideration, structure 1A resolves it, and at no tax cost.</w:t>
+      </w:r>
+    </w:p>
+    <w:p>
+      <w:pPr>
+        <w:keepLines/>
+        <w:spacing w:after="110" w:line="248" w:lineRule="auto"/>
+        <w:jc w:val="both"/>
+      </w:pPr>
+      <w:r>
+        <w:rPr>
+          <w:rFonts w:ascii="Arial" w:cs="Arial" w:eastAsia="Arial" w:hAnsi="Arial"/>
+          <w:b/>
+          <w:bCs/>
+          <w:i w:val="false"/>
+          <w:iCs w:val="false"/>
+          <w:caps w:val="false"/>
+          <w:color w:val="000000"/>
+          <w:sz w:val="18"/>
+          <w:szCs w:val="18"/>
+        </w:rPr>
+        <w:t xml:space="preserve">The funds flow.  </w:t>
+      </w:r>
+      <w:r>
+        <w:rPr>
+          <w:rFonts w:ascii="Arial" w:cs="Arial" w:eastAsia="Arial" w:hAnsi="Arial"/>
+          <w:b w:val="false"/>
+          <w:bCs w:val="false"/>
+          <w:i w:val="false"/>
+          <w:iCs w:val="false"/>
+          <w:caps w:val="false"/>
+          <w:color w:val="000000"/>
+          <w:sz w:val="18"/>
+          <w:szCs w:val="18"/>
+        </w:rPr>
+        <w:t xml:space="preserve">A remittance of this size from Nigeria will attract extended due diligence whichever structure is chosen. Source-of-funds evidence should be assembled before the remittance, the exchange control position confirmed at the sending end, and the banking route agreed as viable before implementation. The sequence matters as much as the source: the advance must be received before any repayment to Mr Levy, and the rationale recorded at the time. Where the bank prefers a Cyprus point of entry, the finance company itself provides one.</w:t>
       </w:r>
     </w:p>
     <w:p>
@@ -7369,7 +6573,7 @@
           <w:sz w:val="14"/>
           <w:szCs w:val="14"/>
         </w:rPr>
-        <w:t xml:space="preserve">This paper is prepared by Vertu Projects Ltd for discussion with the shareholders of Keytree Limited and is not to be issued to third parties. Figures are taken from the draft financial statements for the year ended 31 December 2025 and have not been independently verified. Nothing in this paper constitutes a binding tax opinion; the matters listed above require confirmation before any structure is implemented.</w:t>
+        <w:t xml:space="preserve">This paper is prepared by Vertu Projects Ltd for discussion with the shareholders of Keytree Limited and is not to be issued to third parties. Figures are taken from the draft financial statements for the year ended 31 December 2025 and have not been independently verified. Nothing in this paper constitutes a binding tax opinion; the matters identified in this paper require confirmation before any structure is implemented.</w:t>
       </w:r>
     </w:p>
     <w:sectPr>
@@ -7625,7 +6829,7 @@
         <w:bottom w:val="single" w:color="BFBFBF" w:sz="4" w:space="4"/>
       </w:pBdr>
       <w:tabs>
-        <w:tab w:val="right" w:pos="9576"/>
+        <w:tab w:val="right" w:pos="9750"/>
       </w:tabs>
       <w:spacing w:after="60"/>
     </w:pPr>
@@ -7701,7 +6905,7 @@
         <w:bottom w:val="single" w:color="BFBFBF" w:sz="4" w:space="4"/>
       </w:pBdr>
       <w:tabs>
-        <w:tab w:val="right" w:pos="9576"/>
+        <w:tab w:val="right" w:pos="9750"/>
       </w:tabs>
       <w:spacing w:after="60"/>
     </w:pPr>

</xml_diff>